<commit_message>
trochu dokumentace, trochu zmeny css a js
</commit_message>
<xml_diff>
--- a/dokumentace.docx
+++ b/dokumentace.docx
@@ -5,6 +5,7 @@
     <w:p>
       <w:pPr>
         <w:pStyle w:val="Zhlav"/>
+        <w:jc w:val="center"/>
       </w:pPr>
       <w:r>
         <w:rPr>
@@ -3255,16 +3256,16 @@
                 <v:path o:extrusionok="f" gradientshapeok="t" o:connecttype="rect"/>
                 <o:lock v:ext="edit" aspectratio="t"/>
               </v:shapetype>
-              <v:shape id="_x0000_s2067" type="#_x0000_t75" alt="Obsah obrázku text, oblečení, snímek obrazovky, boty&#10;&#10;Popis byl vytvořen automaticky" style="position:absolute;left:9144;top:291;width:36690;height:17774;visibility:visible;mso-wrap-style:square" o:gfxdata="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">
+              <v:shape id="_x0000_s2067" type="#_x0000_t75" alt="Obsah obrázku text, oblečení, snímek obrazovky, boty&#10;&#10;Popis byl vytvořen automaticky" style="position:absolute;left:9144;top:291;width:36690;height:17774;visibility:visible" o:gfxdata="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">
                 <v:imagedata r:id="rId13" o:title="Obsah obrázku text, oblečení, snímek obrazovky, boty&#10;&#10;Popis byl vytvořen automaticky"/>
               </v:shape>
-              <v:rect id="Obdélník 3" o:spid="_x0000_s2068" style="position:absolute;width:54622;height:21590;visibility:visible;mso-wrap-style:square;v-text-anchor:middle" o:gfxdata="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" filled="f" stroked="f" strokeweight="2pt"/>
+              <v:rect id="Obdélník 3" o:spid="_x0000_s2068" style="position:absolute;width:54622;height:21590;visibility:visible;v-text-anchor:middle" o:gfxdata="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" filled="f" stroked="f" strokeweight="2pt"/>
             </v:group>
             <v:shapetype id="_x0000_t202" coordsize="21600,21600" o:spt="202" path="m,l,21600r21600,l21600,xe">
               <v:stroke joinstyle="miter"/>
               <v:path gradientshapeok="t" o:connecttype="rect"/>
             </v:shapetype>
-            <v:shape id="Textové pole 5" o:spid="_x0000_s2069" type="#_x0000_t202" style="position:absolute;left:4992;top:14093;width:2778;height:680;visibility:visible;mso-wrap-style:square;mso-position-horizontal:center;mso-position-horizontal-relative:margin;v-text-anchor:top" filled="f" stroked="f" strokeweight=".5pt">
+            <v:shape id="Textové pole 5" o:spid="_x0000_s2069" type="#_x0000_t202" style="position:absolute;left:4992;top:14093;width:2778;height:680;visibility:visible;mso-position-horizontal:center;mso-position-horizontal-relative:margin" filled="f" stroked="f" strokeweight=".5pt">
               <v:textbox style="mso-next-textbox:#Textové pole 5">
                 <w:txbxContent>
                   <w:p>
@@ -3424,12 +3425,12 @@
         <w:pict w14:anchorId="33AD7FB2">
           <v:group id="_x0000_s2072" style="position:absolute;left:0;text-align:left;margin-left:-21.4pt;margin-top:35.6pt;width:439.3pt;height:214.8pt;z-index:251657728" coordorigin="1557,8824" coordsize="8786,4296">
             <v:group id="Skupina 4" o:spid="_x0000_s2061" style="position:absolute;left:1557;top:8824;width:8786;height:4296" coordsize="67218,32879" o:gfxdata="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">
-              <v:shape id="_x0000_s2062" type="#_x0000_t75" alt="Obsah obrázku text, snímek obrazovky, osoba, boty&#10;&#10;Popis byl vytvořen automaticky" style="position:absolute;left:12096;top:407;width:43206;height:20925;visibility:visible;mso-wrap-style:square" o:gfxdata="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">
+              <v:shape id="_x0000_s2062" type="#_x0000_t75" alt="Obsah obrázku text, snímek obrazovky, osoba, boty&#10;&#10;Popis byl vytvořen automaticky" style="position:absolute;left:12096;top:407;width:43206;height:20925;visibility:visible" o:gfxdata="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">
                 <v:imagedata r:id="rId15" o:title="Obsah obrázku text, snímek obrazovky, osoba, boty&#10;&#10;Popis byl vytvořen automaticky"/>
               </v:shape>
-              <v:rect id="Obdélník 3" o:spid="_x0000_s2063" style="position:absolute;width:67218;height:32879;visibility:visible;mso-wrap-style:square;v-text-anchor:middle" o:gfxdata="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" filled="f" stroked="f" strokeweight="2pt"/>
+              <v:rect id="Obdélník 3" o:spid="_x0000_s2063" style="position:absolute;width:67218;height:32879;visibility:visible;v-text-anchor:middle" o:gfxdata="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" filled="f" stroked="f" strokeweight="2pt"/>
             </v:group>
-            <v:shape id="Textové pole 5" o:spid="_x0000_s2064" type="#_x0000_t202" style="position:absolute;left:4760;top:11557;width:2381;height:672;visibility:visible;mso-wrap-style:square;v-text-anchor:top" filled="f" stroked="f" strokeweight=".5pt">
+            <v:shape id="Textové pole 5" o:spid="_x0000_s2064" type="#_x0000_t202" style="position:absolute;left:4760;top:11557;width:2381;height:672;visibility:visible" filled="f" stroked="f" strokeweight=".5pt">
               <v:textbox>
                 <w:txbxContent>
                   <w:p>
@@ -3609,12 +3610,12 @@
         </w:rPr>
         <w:pict w14:anchorId="5CDA8AD8">
           <v:group id="_x0000_s2074" style="position:absolute;left:0;text-align:left;margin-left:-16.55pt;margin-top:29.05pt;width:430.1pt;height:168.5pt;z-index:251658752;mso-position-horizontal-relative:text;mso-position-vertical-relative:text" coordorigin="1654,8716" coordsize="8602,3370">
-            <v:shape id="_x0000_s2059" type="#_x0000_t75" alt="Obsah obrázku text, snímek obrazovky, basketbal, Multimediální software&#10;&#10;Popis byl vytvořen automaticky" style="position:absolute;left:3514;top:8717;width:5734;height:2768;visibility:visible;mso-wrap-style:square;mso-position-horizontal:center;mso-position-horizontal-relative:margin">
+            <v:shape id="_x0000_s2059" type="#_x0000_t75" alt="Obsah obrázku text, snímek obrazovky, basketbal, Multimediální software&#10;&#10;Popis byl vytvořen automaticky" style="position:absolute;left:3514;top:8717;width:5734;height:2768;visibility:visible;mso-position-horizontal:center;mso-position-horizontal-relative:margin">
               <v:imagedata r:id="rId17" o:title="Obsah obrázku text, snímek obrazovky, basketbal, Multimediální software&#10;&#10;Popis byl vytvořen automaticky"/>
             </v:shape>
             <v:group id="_x0000_s2073" style="position:absolute;left:1654;top:8716;width:8602;height:3370" coordorigin="1654,8716" coordsize="8602,3370">
-              <v:rect id="Obdélník 3" o:spid="_x0000_s2057" style="position:absolute;left:1654;top:8716;width:8602;height:3370;visibility:visible;mso-wrap-style:square;v-text-anchor:middle" o:gfxdata="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" filled="f" stroked="f" strokeweight="2pt"/>
-              <v:shape id="Textové pole 5" o:spid="_x0000_s2058" type="#_x0000_t202" style="position:absolute;left:5163;top:11391;width:2438;height:606;visibility:visible;mso-wrap-style:square;mso-position-horizontal:center;mso-position-horizontal-relative:margin;v-text-anchor:top" filled="f" stroked="f" strokeweight=".5pt">
+              <v:rect id="Obdélník 3" o:spid="_x0000_s2057" style="position:absolute;left:1654;top:8716;width:8602;height:3370;visibility:visible;v-text-anchor:middle" o:gfxdata="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" filled="f" stroked="f" strokeweight="2pt"/>
+              <v:shape id="Textové pole 5" o:spid="_x0000_s2058" type="#_x0000_t202" style="position:absolute;left:5163;top:11391;width:2438;height:606;visibility:visible;mso-position-horizontal:center;mso-position-horizontal-relative:margin" filled="f" stroked="f" strokeweight=".5pt">
                 <v:textbox>
                   <w:txbxContent>
                     <w:p>
@@ -3998,10 +3999,7 @@
     </w:p>
     <w:p>
       <w:r>
-        <w:t>E-shop spravován administrátory</w:t>
-      </w:r>
-      <w:r>
-        <w:t xml:space="preserve">. Aby administrátoři mohli spravovat webovou stránku, mají odlišnou roli od zaregistrovaných uživatelů, konkrétně hodnotu 3. </w:t>
+        <w:t xml:space="preserve">E-shop spravován administrátory. Aby administrátoři mohli spravovat webovou stránku, mají odlišnou roli od zaregistrovaných uživatelů, konkrétně hodnotu 3. </w:t>
       </w:r>
       <w:r>
         <w:t>Díky číslu příslušící ke každé roli se docílí, že se vypíšou konkrétní informaci či možnosti spravování pro každou roli. Uživatelé mající roli admina mají všechna práva ze všech. Jestliže se</w:t>
@@ -4085,10 +4083,7 @@
     </w:p>
     <w:p>
       <w:r>
-        <w:t xml:space="preserve">Pro odstranění produktu </w:t>
-      </w:r>
-      <w:r>
-        <w:t>se objeví dialogové okno, kde uživatel potvrdí své rozhodnutí smazání produktu, eventuálně tu má možnost si to rozmyslet a zrušit smazání daného produktu.</w:t>
+        <w:t>Pro odstranění produktu se objeví dialogové okno, kde uživatel potvrdí své rozhodnutí smazání produktu, eventuálně tu má možnost si to rozmyslet a zrušit smazání daného produktu.</w:t>
       </w:r>
     </w:p>
     <w:p>
@@ -4158,16 +4153,7 @@
     </w:p>
     <w:p>
       <w:r>
-        <w:t>Recenze</w:t>
-      </w:r>
-      <w:r>
-        <w:t xml:space="preserve"> nejsou spravovány přímo v administrační části webu, ale přímo u produktu</w:t>
-      </w:r>
-      <w:r>
-        <w:t>. Administrátor má právo odstranit jakékoli nevhodné recenze uživatelů. Samotní uživatelé mají možnost mazat své vlastní recenze přímo</w:t>
-      </w:r>
-      <w:r>
-        <w:t xml:space="preserve"> u zakoupené produktu. Pokud se uživatel nerozhodne svoji recenzi smazat, může ji editovat a opravit recenzi, pokud si rozmyslel, co napsal. Když se rozhodne nakonec recenzi smazat, může napsat novou jinačí recenzi.</w:t>
+        <w:t>Recenze nejsou spravovány přímo v administrační části webu, ale přímo u produktu. Administrátor má právo odstranit jakékoli nevhodné recenze uživatelů. Samotní uživatelé mají možnost mazat své vlastní recenze přímo u zakoupené produktu. Pokud se uživatel nerozhodne svoji recenzi smazat, může ji editovat a opravit recenzi, pokud si rozmyslel, co napsal. Když se rozhodne nakonec recenzi smazat, může napsat novou jinačí recenzi.</w:t>
       </w:r>
     </w:p>
     <w:p>
@@ -4181,7 +4167,7 @@
         </w:rPr>
         <w:lastRenderedPageBreak/>
         <w:pict w14:anchorId="1E0F3DCF">
-          <v:shape id="Textové pole 6" o:spid="_x0000_s2052" type="#_x0000_t202" style="position:absolute;left:0;text-align:left;margin-left:138pt;margin-top:405.25pt;width:161.55pt;height:31.75pt;z-index:251665920;visibility:visible;mso-wrap-style:square;mso-position-horizontal-relative:margin;v-text-anchor:top" filled="f" fillcolor="white [3201]" stroked="f" strokeweight=".5pt">
+          <v:shape id="Textové pole 6" o:spid="_x0000_s2052" type="#_x0000_t202" style="position:absolute;left:0;text-align:left;margin-left:138pt;margin-top:405.25pt;width:161.55pt;height:31.75pt;z-index:251665920;visibility:visible;mso-position-horizontal-relative:margin" filled="f" fillcolor="white [3201]" stroked="f" strokeweight=".5pt">
             <v:textbox style="mso-next-textbox:#Textové pole 6">
               <w:txbxContent>
                 <w:p>
@@ -4215,7 +4201,7 @@
           <w:noProof/>
         </w:rPr>
         <w:pict w14:anchorId="03107473">
-          <v:shape id="Obrázek 1" o:spid="_x0000_s2054" type="#_x0000_t75" alt="Obsah obrázku text, diagram, Plán, Písmo&#10;&#10;Popis byl vytvořen automaticky" style="position:absolute;left:0;text-align:left;margin-left:0;margin-top:55.1pt;width:439.35pt;height:354.65pt;z-index:251664896;visibility:visible;mso-wrap-style:square;mso-position-horizontal:center;mso-position-horizontal-relative:margin">
+          <v:shape id="Obrázek 1" o:spid="_x0000_s2054" type="#_x0000_t75" alt="Obsah obrázku text, diagram, Plán, Písmo&#10;&#10;Popis byl vytvořen automaticky" style="position:absolute;left:0;text-align:left;margin-left:0;margin-top:55.1pt;width:439.35pt;height:354.65pt;z-index:251664896;visibility:visible;mso-position-horizontal:center;mso-position-horizontal-relative:margin">
             <v:imagedata r:id="rId19" o:title="Obsah obrázku text, diagram, Plán, Písmo&#10;&#10;Popis byl vytvořen automaticky"/>
             <w10:wrap type="square" anchorx="margin"/>
           </v:shape>
@@ -4490,7 +4476,7 @@
         </w:rPr>
         <w:lastRenderedPageBreak/>
         <w:pict w14:anchorId="6C7321D8">
-          <v:shape id="_x0000_s2085" type="#_x0000_t202" style="position:absolute;left:0;text-align:left;margin-left:40.25pt;margin-top:388.1pt;width:315.45pt;height:45.9pt;z-index:251688960;visibility:visible;mso-height-percent:200;mso-wrap-distance-left:9pt;mso-wrap-distance-top:3.6pt;mso-wrap-distance-right:9pt;mso-wrap-distance-bottom:3.6pt;mso-position-horizontal-relative:text;mso-position-vertical-relative:text;mso-height-percent:200;mso-width-relative:margin;mso-height-relative:margin;v-text-anchor:top" filled="f" stroked="f">
+          <v:shape id="_x0000_s2085" type="#_x0000_t202" style="position:absolute;left:0;text-align:left;margin-left:40.25pt;margin-top:388.1pt;width:315.45pt;height:45.9pt;z-index:251688960;visibility:visible;mso-height-percent:200;mso-wrap-distance-top:3.6pt;mso-wrap-distance-bottom:3.6pt;mso-height-percent:200;mso-width-relative:margin;mso-height-relative:margin" filled="f" stroked="f">
             <v:textbox style="mso-next-textbox:#_x0000_s2085;mso-fit-shape-to-text:t">
               <w:txbxContent>
                 <w:p>
@@ -4595,7 +4581,7 @@
           <w:noProof/>
         </w:rPr>
         <w:pict w14:anchorId="3B4850B8">
-          <v:shape id="_x0000_s2083" type="#_x0000_t202" style="position:absolute;left:0;text-align:left;margin-left:40.55pt;margin-top:138.55pt;width:315.45pt;height:45.9pt;z-index:251686912;visibility:visible;mso-height-percent:200;mso-wrap-distance-left:9pt;mso-wrap-distance-top:3.6pt;mso-wrap-distance-right:9pt;mso-wrap-distance-bottom:3.6pt;mso-position-horizontal-relative:text;mso-position-vertical-relative:text;mso-height-percent:200;mso-width-relative:margin;mso-height-relative:margin;v-text-anchor:top" filled="f" stroked="f">
+          <v:shape id="_x0000_s2083" type="#_x0000_t202" style="position:absolute;left:0;text-align:left;margin-left:40.55pt;margin-top:138.55pt;width:315.45pt;height:45.9pt;z-index:251686912;visibility:visible;mso-height-percent:200;mso-wrap-distance-top:3.6pt;mso-wrap-distance-bottom:3.6pt;mso-position-horizontal-relative:text;mso-position-vertical-relative:text;mso-height-percent:200;mso-width-relative:margin;mso-height-relative:margin" filled="f" stroked="f">
             <v:textbox style="mso-next-textbox:#_x0000_s2083;mso-fit-shape-to-text:t">
               <w:txbxContent>
                 <w:p>
@@ -4746,7 +4732,7 @@
           <w:noProof/>
         </w:rPr>
         <w:pict w14:anchorId="14FA96AD">
-          <v:shape id="_x0000_s2086" type="#_x0000_t202" style="position:absolute;left:0;text-align:left;margin-left:74.1pt;margin-top:256.5pt;width:247.2pt;height:45.9pt;z-index:251689984;visibility:visible;mso-height-percent:200;mso-wrap-distance-left:9pt;mso-wrap-distance-top:3.6pt;mso-wrap-distance-right:9pt;mso-wrap-distance-bottom:3.6pt;mso-position-horizontal-relative:text;mso-position-vertical-relative:text;mso-height-percent:200;mso-width-relative:margin;mso-height-relative:margin;v-text-anchor:top" filled="f" stroked="f">
+          <v:shape id="_x0000_s2086" type="#_x0000_t202" style="position:absolute;left:0;text-align:left;margin-left:74.1pt;margin-top:256.5pt;width:247.2pt;height:45.9pt;z-index:251689984;visibility:visible;mso-height-percent:200;mso-wrap-distance-top:3.6pt;mso-wrap-distance-bottom:3.6pt;mso-height-percent:200;mso-width-relative:margin;mso-height-relative:margin" filled="f" stroked="f">
             <v:textbox style="mso-next-textbox:#_x0000_s2086;mso-fit-shape-to-text:t">
               <w:txbxContent>
                 <w:p>
@@ -4794,7 +4780,7 @@
         </w:rPr>
         <w:lastRenderedPageBreak/>
         <w:pict w14:anchorId="604D6A79">
-          <v:shape id="_x0000_s2087" type="#_x0000_t202" style="position:absolute;left:0;text-align:left;margin-left:58.15pt;margin-top:176.6pt;width:250.95pt;height:45.9pt;z-index:-251625472;visibility:visible;mso-height-percent:200;mso-wrap-distance-left:9pt;mso-wrap-distance-top:3.6pt;mso-wrap-distance-right:9pt;mso-wrap-distance-bottom:3.6pt;mso-position-horizontal-relative:margin;mso-position-vertical-relative:text;mso-height-percent:200;mso-width-relative:margin;mso-height-relative:margin;v-text-anchor:top" wrapcoords="0 0" filled="f" stroked="f">
+          <v:shape id="_x0000_s2087" type="#_x0000_t202" style="position:absolute;left:0;text-align:left;margin-left:58.15pt;margin-top:176.6pt;width:250.95pt;height:45.9pt;z-index:-251625472;visibility:visible;mso-height-percent:200;mso-wrap-distance-top:3.6pt;mso-wrap-distance-bottom:3.6pt;mso-position-horizontal-relative:margin;mso-height-percent:200;mso-width-relative:margin;mso-height-relative:margin" wrapcoords="0 0" filled="f" stroked="f">
             <v:textbox style="mso-next-textbox:#_x0000_s2087;mso-fit-shape-to-text:t">
               <w:txbxContent>
                 <w:p>
@@ -4994,6 +4980,2878 @@
       </w:r>
       <w:bookmarkEnd w:id="24"/>
     </w:p>
+    <w:p>
+      <w:r>
+        <w:t>Při navštívení e-shopu se uživateli zobrazí hlavní stránka.</w:t>
+      </w:r>
+      <w:r>
+        <w:t xml:space="preserve"> Součástí stránky je horní hlavní menu</w:t>
+      </w:r>
+      <w:r>
+        <w:t xml:space="preserve">, kudy </w:t>
+      </w:r>
+      <w:r>
+        <w:t>se jde</w:t>
+      </w:r>
+      <w:r>
+        <w:t xml:space="preserve"> navigovat dál po stránce</w:t>
+      </w:r>
+      <w:r>
+        <w:t xml:space="preserve">. </w:t>
+      </w:r>
+      <w:r>
+        <w:t xml:space="preserve">Úplně vlevo se nachází piktogram menu. Po kliknutí na něj vyjede postranní panel, kde </w:t>
+      </w:r>
+      <w:r>
+        <w:t>je položka účtu, kam uživatel může zadat své údaje pro přihlášení, nebo registraci.</w:t>
+      </w:r>
+    </w:p>
+    <w:p>
+      <w:r>
+        <w:t>P</w:t>
+      </w:r>
+      <w:r>
+        <w:t xml:space="preserve">ro </w:t>
+      </w:r>
+      <w:r>
+        <w:t>registraci</w:t>
+      </w:r>
+      <w:r>
+        <w:t xml:space="preserve"> zákazníka j</w:t>
+      </w:r>
+      <w:r>
+        <w:t>e potřeba 9</w:t>
+      </w:r>
+      <w:r>
+        <w:t xml:space="preserve"> vstup</w:t>
+      </w:r>
+      <w:r>
+        <w:t>ů pro jméno, příjmení, email, telefonní číslo, 2 pro hesla, aby si zákazník potvrdil svoje heslo, město, ulici a poštovní směrovací číslo</w:t>
+      </w:r>
+      <w:r>
+        <w:t>.</w:t>
+      </w:r>
+      <w:r>
+        <w:t xml:space="preserve"> Před tím, než se odešlou zadané údaje o zákazníkovi, zavolá se funkce pro zkontrolování údajů</w:t>
+      </w:r>
+      <w:r>
+        <w:t xml:space="preserve">. </w:t>
+      </w:r>
+    </w:p>
+    <w:p>
+      <w:r>
+        <w:t>Nejdřív se prověří</w:t>
+      </w:r>
+      <w:r>
+        <w:t xml:space="preserve"> </w:t>
+      </w:r>
+      <w:r>
+        <w:t>přes for of loop</w:t>
+      </w:r>
+      <w:r>
+        <w:t>, zda jsou všechna vstupní pole vyplněná, kde se prochází všechny vstupní pole pro zadávání informací.</w:t>
+      </w:r>
+      <w:r>
+        <w:t xml:space="preserve"> Pokud se najde prázdné pole, smyčka se zastaví. A uživatel dostane zprávu o nevyplněn</w:t>
+      </w:r>
+      <w:r>
+        <w:t>ém poli.</w:t>
+      </w:r>
+    </w:p>
+    <w:p>
+      <w:pPr>
+        <w:shd w:val="clear" w:color="auto" w:fill="FFFFFF"/>
+        <w:spacing w:before="0" w:after="0" w:line="285" w:lineRule="atLeast"/>
+        <w:ind w:firstLine="0"/>
+        <w:jc w:val="left"/>
+        <w:rPr>
+          <w:rFonts w:ascii="Consolas" w:hAnsi="Consolas"/>
+          <w:color w:val="000000"/>
+          <w:sz w:val="21"/>
+          <w:szCs w:val="21"/>
+          <w:lang w:val="en-US" w:eastAsia="en-US"/>
+        </w:rPr>
+      </w:pPr>
+      <w:r>
+        <w:rPr>
+          <w:rFonts w:ascii="Consolas" w:hAnsi="Consolas"/>
+          <w:color w:val="AF00DB"/>
+          <w:sz w:val="21"/>
+          <w:szCs w:val="21"/>
+          <w:lang w:val="en-US" w:eastAsia="en-US"/>
+        </w:rPr>
+        <w:t>for</w:t>
+      </w:r>
+      <w:r>
+        <w:rPr>
+          <w:rFonts w:ascii="Consolas" w:hAnsi="Consolas"/>
+          <w:color w:val="000000"/>
+          <w:sz w:val="21"/>
+          <w:szCs w:val="21"/>
+          <w:lang w:val="en-US" w:eastAsia="en-US"/>
+        </w:rPr>
+        <w:t xml:space="preserve"> (</w:t>
+      </w:r>
+      <w:r>
+        <w:rPr>
+          <w:rFonts w:ascii="Consolas" w:hAnsi="Consolas"/>
+          <w:color w:val="0000FF"/>
+          <w:sz w:val="21"/>
+          <w:szCs w:val="21"/>
+          <w:lang w:val="en-US" w:eastAsia="en-US"/>
+        </w:rPr>
+        <w:t>const</w:t>
+      </w:r>
+      <w:r>
+        <w:rPr>
+          <w:rFonts w:ascii="Consolas" w:hAnsi="Consolas"/>
+          <w:color w:val="000000"/>
+          <w:sz w:val="21"/>
+          <w:szCs w:val="21"/>
+          <w:lang w:val="en-US" w:eastAsia="en-US"/>
+        </w:rPr>
+        <w:t xml:space="preserve"> </w:t>
+      </w:r>
+      <w:r>
+        <w:rPr>
+          <w:rFonts w:ascii="Consolas" w:hAnsi="Consolas"/>
+          <w:color w:val="0070C1"/>
+          <w:sz w:val="21"/>
+          <w:szCs w:val="21"/>
+          <w:lang w:val="en-US" w:eastAsia="en-US"/>
+        </w:rPr>
+        <w:t>element</w:t>
+      </w:r>
+      <w:r>
+        <w:rPr>
+          <w:rFonts w:ascii="Consolas" w:hAnsi="Consolas"/>
+          <w:color w:val="000000"/>
+          <w:sz w:val="21"/>
+          <w:szCs w:val="21"/>
+          <w:lang w:val="en-US" w:eastAsia="en-US"/>
+        </w:rPr>
+        <w:t xml:space="preserve"> </w:t>
+      </w:r>
+      <w:r>
+        <w:rPr>
+          <w:rFonts w:ascii="Consolas" w:hAnsi="Consolas"/>
+          <w:color w:val="0000FF"/>
+          <w:sz w:val="21"/>
+          <w:szCs w:val="21"/>
+          <w:lang w:val="en-US" w:eastAsia="en-US"/>
+        </w:rPr>
+        <w:t>of</w:t>
+      </w:r>
+      <w:r>
+        <w:rPr>
+          <w:rFonts w:ascii="Consolas" w:hAnsi="Consolas"/>
+          <w:color w:val="000000"/>
+          <w:sz w:val="21"/>
+          <w:szCs w:val="21"/>
+          <w:lang w:val="en-US" w:eastAsia="en-US"/>
+        </w:rPr>
+        <w:t xml:space="preserve"> </w:t>
+      </w:r>
+      <w:r>
+        <w:rPr>
+          <w:rFonts w:ascii="Consolas" w:hAnsi="Consolas"/>
+          <w:color w:val="001080"/>
+          <w:sz w:val="21"/>
+          <w:szCs w:val="21"/>
+          <w:lang w:val="en-US" w:eastAsia="en-US"/>
+        </w:rPr>
+        <w:t>inputy</w:t>
+      </w:r>
+      <w:r>
+        <w:rPr>
+          <w:rFonts w:ascii="Consolas" w:hAnsi="Consolas"/>
+          <w:color w:val="000000"/>
+          <w:sz w:val="21"/>
+          <w:szCs w:val="21"/>
+          <w:lang w:val="en-US" w:eastAsia="en-US"/>
+        </w:rPr>
+        <w:t>) {</w:t>
+      </w:r>
+    </w:p>
+    <w:p>
+      <w:pPr>
+        <w:shd w:val="clear" w:color="auto" w:fill="FFFFFF"/>
+        <w:spacing w:before="0" w:after="0" w:line="285" w:lineRule="atLeast"/>
+        <w:ind w:firstLine="0"/>
+        <w:jc w:val="left"/>
+        <w:rPr>
+          <w:rFonts w:ascii="Consolas" w:hAnsi="Consolas"/>
+          <w:color w:val="000000"/>
+          <w:sz w:val="21"/>
+          <w:szCs w:val="21"/>
+          <w:lang w:val="en-US" w:eastAsia="en-US"/>
+        </w:rPr>
+      </w:pPr>
+      <w:r>
+        <w:rPr>
+          <w:rFonts w:ascii="Consolas" w:hAnsi="Consolas"/>
+          <w:color w:val="000000"/>
+          <w:sz w:val="21"/>
+          <w:szCs w:val="21"/>
+          <w:lang w:val="en-US" w:eastAsia="en-US"/>
+        </w:rPr>
+        <w:t xml:space="preserve">        </w:t>
+      </w:r>
+      <w:r>
+        <w:rPr>
+          <w:rFonts w:ascii="Consolas" w:hAnsi="Consolas"/>
+          <w:color w:val="AF00DB"/>
+          <w:sz w:val="21"/>
+          <w:szCs w:val="21"/>
+          <w:lang w:val="en-US" w:eastAsia="en-US"/>
+        </w:rPr>
+        <w:t>if</w:t>
+      </w:r>
+      <w:r>
+        <w:rPr>
+          <w:rFonts w:ascii="Consolas" w:hAnsi="Consolas"/>
+          <w:color w:val="000000"/>
+          <w:sz w:val="21"/>
+          <w:szCs w:val="21"/>
+          <w:lang w:val="en-US" w:eastAsia="en-US"/>
+        </w:rPr>
+        <w:t>(</w:t>
+      </w:r>
+      <w:r>
+        <w:rPr>
+          <w:rFonts w:ascii="Consolas" w:hAnsi="Consolas"/>
+          <w:color w:val="0070C1"/>
+          <w:sz w:val="21"/>
+          <w:szCs w:val="21"/>
+          <w:lang w:val="en-US" w:eastAsia="en-US"/>
+        </w:rPr>
+        <w:t>element</w:t>
+      </w:r>
+      <w:r>
+        <w:rPr>
+          <w:rFonts w:ascii="Consolas" w:hAnsi="Consolas"/>
+          <w:color w:val="000000"/>
+          <w:sz w:val="21"/>
+          <w:szCs w:val="21"/>
+          <w:lang w:val="en-US" w:eastAsia="en-US"/>
+        </w:rPr>
+        <w:t>.</w:t>
+      </w:r>
+      <w:r>
+        <w:rPr>
+          <w:rFonts w:ascii="Consolas" w:hAnsi="Consolas"/>
+          <w:color w:val="001080"/>
+          <w:sz w:val="21"/>
+          <w:szCs w:val="21"/>
+          <w:lang w:val="en-US" w:eastAsia="en-US"/>
+        </w:rPr>
+        <w:t>value</w:t>
+      </w:r>
+      <w:r>
+        <w:rPr>
+          <w:rFonts w:ascii="Consolas" w:hAnsi="Consolas"/>
+          <w:color w:val="000000"/>
+          <w:sz w:val="21"/>
+          <w:szCs w:val="21"/>
+          <w:lang w:val="en-US" w:eastAsia="en-US"/>
+        </w:rPr>
+        <w:t xml:space="preserve"> == </w:t>
+      </w:r>
+      <w:r>
+        <w:rPr>
+          <w:rFonts w:ascii="Consolas" w:hAnsi="Consolas"/>
+          <w:color w:val="A31515"/>
+          <w:sz w:val="21"/>
+          <w:szCs w:val="21"/>
+          <w:lang w:val="en-US" w:eastAsia="en-US"/>
+        </w:rPr>
+        <w:t>""</w:t>
+      </w:r>
+      <w:r>
+        <w:rPr>
+          <w:rFonts w:ascii="Consolas" w:hAnsi="Consolas"/>
+          <w:color w:val="000000"/>
+          <w:sz w:val="21"/>
+          <w:szCs w:val="21"/>
+          <w:lang w:val="en-US" w:eastAsia="en-US"/>
+        </w:rPr>
+        <w:t>) {</w:t>
+      </w:r>
+    </w:p>
+    <w:p>
+      <w:pPr>
+        <w:shd w:val="clear" w:color="auto" w:fill="FFFFFF"/>
+        <w:spacing w:before="0" w:after="0" w:line="285" w:lineRule="atLeast"/>
+        <w:ind w:firstLine="0"/>
+        <w:jc w:val="left"/>
+        <w:rPr>
+          <w:rFonts w:ascii="Consolas" w:hAnsi="Consolas"/>
+          <w:color w:val="000000"/>
+          <w:sz w:val="21"/>
+          <w:szCs w:val="21"/>
+          <w:lang w:val="en-US" w:eastAsia="en-US"/>
+        </w:rPr>
+      </w:pPr>
+      <w:r>
+        <w:rPr>
+          <w:rFonts w:ascii="Consolas" w:hAnsi="Consolas"/>
+          <w:color w:val="000000"/>
+          <w:sz w:val="21"/>
+          <w:szCs w:val="21"/>
+          <w:lang w:val="en-US" w:eastAsia="en-US"/>
+        </w:rPr>
+        <w:t xml:space="preserve">            </w:t>
+      </w:r>
+      <w:r>
+        <w:rPr>
+          <w:rFonts w:ascii="Consolas" w:hAnsi="Consolas"/>
+          <w:color w:val="001080"/>
+          <w:sz w:val="21"/>
+          <w:szCs w:val="21"/>
+          <w:lang w:val="en-US" w:eastAsia="en-US"/>
+        </w:rPr>
+        <w:t>zprava</w:t>
+      </w:r>
+      <w:r>
+        <w:rPr>
+          <w:rFonts w:ascii="Consolas" w:hAnsi="Consolas"/>
+          <w:color w:val="000000"/>
+          <w:sz w:val="21"/>
+          <w:szCs w:val="21"/>
+          <w:lang w:val="en-US" w:eastAsia="en-US"/>
+        </w:rPr>
+        <w:t xml:space="preserve"> += </w:t>
+      </w:r>
+      <w:r>
+        <w:rPr>
+          <w:rFonts w:ascii="Consolas" w:hAnsi="Consolas"/>
+          <w:color w:val="A31515"/>
+          <w:sz w:val="21"/>
+          <w:szCs w:val="21"/>
+          <w:lang w:val="en-US" w:eastAsia="en-US"/>
+        </w:rPr>
+        <w:t>"máte nevyplněná pole"</w:t>
+      </w:r>
+    </w:p>
+    <w:p>
+      <w:pPr>
+        <w:shd w:val="clear" w:color="auto" w:fill="FFFFFF"/>
+        <w:spacing w:before="0" w:after="0" w:line="285" w:lineRule="atLeast"/>
+        <w:ind w:firstLine="0"/>
+        <w:jc w:val="left"/>
+        <w:rPr>
+          <w:rFonts w:ascii="Consolas" w:hAnsi="Consolas"/>
+          <w:color w:val="000000"/>
+          <w:sz w:val="21"/>
+          <w:szCs w:val="21"/>
+          <w:lang w:val="en-US" w:eastAsia="en-US"/>
+        </w:rPr>
+      </w:pPr>
+      <w:r>
+        <w:rPr>
+          <w:rFonts w:ascii="Consolas" w:hAnsi="Consolas"/>
+          <w:color w:val="000000"/>
+          <w:sz w:val="21"/>
+          <w:szCs w:val="21"/>
+          <w:lang w:val="en-US" w:eastAsia="en-US"/>
+        </w:rPr>
+        <w:t xml:space="preserve">            </w:t>
+      </w:r>
+      <w:r>
+        <w:rPr>
+          <w:rFonts w:ascii="Consolas" w:hAnsi="Consolas"/>
+          <w:color w:val="001080"/>
+          <w:sz w:val="21"/>
+          <w:szCs w:val="21"/>
+          <w:lang w:val="en-US" w:eastAsia="en-US"/>
+        </w:rPr>
+        <w:t>validace</w:t>
+      </w:r>
+      <w:r>
+        <w:rPr>
+          <w:rFonts w:ascii="Consolas" w:hAnsi="Consolas"/>
+          <w:color w:val="000000"/>
+          <w:sz w:val="21"/>
+          <w:szCs w:val="21"/>
+          <w:lang w:val="en-US" w:eastAsia="en-US"/>
+        </w:rPr>
+        <w:t xml:space="preserve"> = </w:t>
+      </w:r>
+      <w:r>
+        <w:rPr>
+          <w:rFonts w:ascii="Consolas" w:hAnsi="Consolas"/>
+          <w:color w:val="0000FF"/>
+          <w:sz w:val="21"/>
+          <w:szCs w:val="21"/>
+          <w:lang w:val="en-US" w:eastAsia="en-US"/>
+        </w:rPr>
+        <w:t>false</w:t>
+      </w:r>
+    </w:p>
+    <w:p>
+      <w:pPr>
+        <w:shd w:val="clear" w:color="auto" w:fill="FFFFFF"/>
+        <w:spacing w:before="0" w:after="0" w:line="285" w:lineRule="atLeast"/>
+        <w:ind w:firstLine="0"/>
+        <w:jc w:val="left"/>
+        <w:rPr>
+          <w:rFonts w:ascii="Consolas" w:hAnsi="Consolas"/>
+          <w:color w:val="000000"/>
+          <w:sz w:val="21"/>
+          <w:szCs w:val="21"/>
+          <w:lang w:val="en-US" w:eastAsia="en-US"/>
+        </w:rPr>
+      </w:pPr>
+      <w:r>
+        <w:rPr>
+          <w:rFonts w:ascii="Consolas" w:hAnsi="Consolas"/>
+          <w:color w:val="000000"/>
+          <w:sz w:val="21"/>
+          <w:szCs w:val="21"/>
+          <w:lang w:val="en-US" w:eastAsia="en-US"/>
+        </w:rPr>
+        <w:t xml:space="preserve">            </w:t>
+      </w:r>
+      <w:r>
+        <w:rPr>
+          <w:rFonts w:ascii="Consolas" w:hAnsi="Consolas"/>
+          <w:color w:val="AF00DB"/>
+          <w:sz w:val="21"/>
+          <w:szCs w:val="21"/>
+          <w:lang w:val="en-US" w:eastAsia="en-US"/>
+        </w:rPr>
+        <w:t>break</w:t>
+      </w:r>
+    </w:p>
+    <w:p>
+      <w:pPr>
+        <w:shd w:val="clear" w:color="auto" w:fill="FFFFFF"/>
+        <w:spacing w:before="0" w:after="0" w:line="285" w:lineRule="atLeast"/>
+        <w:ind w:firstLine="0"/>
+        <w:jc w:val="left"/>
+        <w:rPr>
+          <w:rFonts w:ascii="Consolas" w:hAnsi="Consolas"/>
+          <w:color w:val="000000"/>
+          <w:sz w:val="21"/>
+          <w:szCs w:val="21"/>
+          <w:lang w:val="en-US" w:eastAsia="en-US"/>
+        </w:rPr>
+      </w:pPr>
+      <w:r>
+        <w:rPr>
+          <w:rFonts w:ascii="Consolas" w:hAnsi="Consolas"/>
+          <w:color w:val="000000"/>
+          <w:sz w:val="21"/>
+          <w:szCs w:val="21"/>
+          <w:lang w:val="en-US" w:eastAsia="en-US"/>
+        </w:rPr>
+        <w:t>        }</w:t>
+      </w:r>
+    </w:p>
+    <w:p>
+      <w:pPr>
+        <w:shd w:val="clear" w:color="auto" w:fill="FFFFFF"/>
+        <w:spacing w:before="0" w:after="0" w:line="285" w:lineRule="atLeast"/>
+        <w:ind w:firstLine="0"/>
+        <w:jc w:val="left"/>
+        <w:rPr>
+          <w:rFonts w:ascii="Consolas" w:hAnsi="Consolas"/>
+          <w:color w:val="000000"/>
+          <w:sz w:val="21"/>
+          <w:szCs w:val="21"/>
+          <w:lang w:val="en-US" w:eastAsia="en-US"/>
+        </w:rPr>
+      </w:pPr>
+      <w:r>
+        <w:rPr>
+          <w:rFonts w:ascii="Consolas" w:hAnsi="Consolas"/>
+          <w:color w:val="000000"/>
+          <w:sz w:val="21"/>
+          <w:szCs w:val="21"/>
+          <w:lang w:val="en-US" w:eastAsia="en-US"/>
+        </w:rPr>
+        <w:t>    }</w:t>
+      </w:r>
+    </w:p>
+    <w:p>
+      <w:pPr>
+        <w:shd w:val="clear" w:color="auto" w:fill="FFFFFF"/>
+        <w:spacing w:before="0" w:after="0" w:line="285" w:lineRule="atLeast"/>
+        <w:ind w:firstLine="0"/>
+        <w:jc w:val="left"/>
+        <w:rPr>
+          <w:rFonts w:ascii="Consolas" w:hAnsi="Consolas"/>
+          <w:color w:val="000000"/>
+          <w:sz w:val="21"/>
+          <w:szCs w:val="21"/>
+          <w:lang w:val="en-US" w:eastAsia="en-US"/>
+        </w:rPr>
+      </w:pPr>
+      <w:r>
+        <w:rPr>
+          <w:rFonts w:ascii="Consolas" w:hAnsi="Consolas"/>
+          <w:color w:val="000000"/>
+          <w:sz w:val="21"/>
+          <w:szCs w:val="21"/>
+          <w:lang w:val="en-US" w:eastAsia="en-US"/>
+        </w:rPr>
+        <w:tab/>
+      </w:r>
+    </w:p>
+    <w:p>
+      <w:pPr>
+        <w:rPr>
+          <w:lang w:val="en-US" w:eastAsia="en-US"/>
+        </w:rPr>
+      </w:pPr>
+      <w:r>
+        <w:rPr>
+          <w:lang w:val="en-US" w:eastAsia="en-US"/>
+        </w:rPr>
+        <w:t xml:space="preserve">Jestliže se nenajde žádné prázdné pole, </w:t>
+      </w:r>
+      <w:r>
+        <w:rPr>
+          <w:lang w:val="en-US" w:eastAsia="en-US"/>
+        </w:rPr>
+        <w:t>přejde</w:t>
+      </w:r>
+      <w:r>
+        <w:rPr>
+          <w:lang w:val="en-US" w:eastAsia="en-US"/>
+        </w:rPr>
+        <w:t xml:space="preserve"> se</w:t>
+      </w:r>
+      <w:r>
+        <w:rPr>
+          <w:lang w:val="en-US" w:eastAsia="en-US"/>
+        </w:rPr>
+        <w:t xml:space="preserve"> na validaci emailu, telefonního čísla, hesla a z</w:t>
+      </w:r>
+      <w:r>
+        <w:rPr>
+          <w:lang w:val="en-US" w:eastAsia="en-US"/>
+        </w:rPr>
+        <w:t>nov</w:t>
+      </w:r>
+      <w:r>
+        <w:rPr>
+          <w:lang w:val="en-US" w:eastAsia="en-US"/>
+        </w:rPr>
+        <w:t>u zadávaného hesla.</w:t>
+      </w:r>
+      <w:r>
+        <w:rPr>
+          <w:lang w:val="en-US" w:eastAsia="en-US"/>
+        </w:rPr>
+        <w:t xml:space="preserve"> Nechceme, aby uživatel zadal chybné údaje o svých základních informací</w:t>
+      </w:r>
+      <w:r>
+        <w:rPr>
+          <w:lang w:val="en-US" w:eastAsia="en-US"/>
+        </w:rPr>
+        <w:t>, neboť by se například nemohl zákazník dostat ke svému účtu.</w:t>
+      </w:r>
+    </w:p>
+    <w:p>
+      <w:pPr>
+        <w:shd w:val="clear" w:color="auto" w:fill="FFFFFF"/>
+        <w:spacing w:before="0" w:after="0" w:line="285" w:lineRule="atLeast"/>
+        <w:ind w:firstLine="0"/>
+        <w:jc w:val="left"/>
+        <w:rPr>
+          <w:rFonts w:ascii="Consolas" w:hAnsi="Consolas"/>
+          <w:color w:val="000000"/>
+          <w:sz w:val="21"/>
+          <w:szCs w:val="21"/>
+          <w:lang w:val="en-US" w:eastAsia="en-US"/>
+        </w:rPr>
+      </w:pPr>
+      <w:r>
+        <w:rPr>
+          <w:rFonts w:ascii="Consolas" w:hAnsi="Consolas"/>
+          <w:color w:val="000000"/>
+          <w:sz w:val="21"/>
+          <w:szCs w:val="21"/>
+          <w:lang w:val="en-US" w:eastAsia="en-US"/>
+        </w:rPr>
+        <w:lastRenderedPageBreak/>
+        <w:t> </w:t>
+      </w:r>
+      <w:r>
+        <w:rPr>
+          <w:rFonts w:ascii="Consolas" w:hAnsi="Consolas"/>
+          <w:color w:val="0000FF"/>
+          <w:sz w:val="21"/>
+          <w:szCs w:val="21"/>
+          <w:lang w:val="en-US" w:eastAsia="en-US"/>
+        </w:rPr>
+        <w:t>let</w:t>
+      </w:r>
+      <w:r>
+        <w:rPr>
+          <w:rFonts w:ascii="Consolas" w:hAnsi="Consolas"/>
+          <w:color w:val="000000"/>
+          <w:sz w:val="21"/>
+          <w:szCs w:val="21"/>
+          <w:lang w:val="en-US" w:eastAsia="en-US"/>
+        </w:rPr>
+        <w:t xml:space="preserve"> </w:t>
+      </w:r>
+      <w:r>
+        <w:rPr>
+          <w:rFonts w:ascii="Consolas" w:hAnsi="Consolas"/>
+          <w:color w:val="001080"/>
+          <w:sz w:val="21"/>
+          <w:szCs w:val="21"/>
+          <w:lang w:val="en-US" w:eastAsia="en-US"/>
+        </w:rPr>
+        <w:t>telefonniCisloRegex</w:t>
+      </w:r>
+      <w:r>
+        <w:rPr>
+          <w:rFonts w:ascii="Consolas" w:hAnsi="Consolas"/>
+          <w:color w:val="000000"/>
+          <w:sz w:val="21"/>
+          <w:szCs w:val="21"/>
+          <w:lang w:val="en-US" w:eastAsia="en-US"/>
+        </w:rPr>
+        <w:t xml:space="preserve"> = </w:t>
+      </w:r>
+      <w:r>
+        <w:rPr>
+          <w:rFonts w:ascii="Consolas" w:hAnsi="Consolas"/>
+          <w:color w:val="811F3F"/>
+          <w:sz w:val="21"/>
+          <w:szCs w:val="21"/>
+          <w:lang w:val="en-US" w:eastAsia="en-US"/>
+        </w:rPr>
+        <w:t>/</w:t>
+      </w:r>
+      <w:r>
+        <w:rPr>
+          <w:rFonts w:ascii="Consolas" w:hAnsi="Consolas"/>
+          <w:color w:val="D16969"/>
+          <w:sz w:val="21"/>
+          <w:szCs w:val="21"/>
+          <w:lang w:val="en-US" w:eastAsia="en-US"/>
+        </w:rPr>
+        <w:t>(</w:t>
+      </w:r>
+      <w:r>
+        <w:rPr>
+          <w:rFonts w:ascii="Consolas" w:hAnsi="Consolas"/>
+          <w:color w:val="EE0000"/>
+          <w:sz w:val="21"/>
+          <w:szCs w:val="21"/>
+          <w:lang w:val="en-US" w:eastAsia="en-US"/>
+        </w:rPr>
+        <w:t>^</w:t>
+      </w:r>
+      <w:r>
+        <w:rPr>
+          <w:rFonts w:ascii="Consolas" w:hAnsi="Consolas"/>
+          <w:color w:val="D16969"/>
+          <w:sz w:val="21"/>
+          <w:szCs w:val="21"/>
+          <w:lang w:val="en-US" w:eastAsia="en-US"/>
+        </w:rPr>
+        <w:t>(</w:t>
+      </w:r>
+      <w:r>
+        <w:rPr>
+          <w:rFonts w:ascii="Consolas" w:hAnsi="Consolas"/>
+          <w:color w:val="EE0000"/>
+          <w:sz w:val="21"/>
+          <w:szCs w:val="21"/>
+          <w:lang w:val="en-US" w:eastAsia="en-US"/>
+        </w:rPr>
+        <w:t>\+</w:t>
+      </w:r>
+      <w:r>
+        <w:rPr>
+          <w:rFonts w:ascii="Consolas" w:hAnsi="Consolas"/>
+          <w:color w:val="D16969"/>
+          <w:sz w:val="21"/>
+          <w:szCs w:val="21"/>
+          <w:lang w:val="en-US" w:eastAsia="en-US"/>
+        </w:rPr>
+        <w:t>[</w:t>
+      </w:r>
+      <w:r>
+        <w:rPr>
+          <w:rFonts w:ascii="Consolas" w:hAnsi="Consolas"/>
+          <w:color w:val="811F3F"/>
+          <w:sz w:val="21"/>
+          <w:szCs w:val="21"/>
+          <w:lang w:val="en-US" w:eastAsia="en-US"/>
+        </w:rPr>
+        <w:t>0-9</w:t>
+      </w:r>
+      <w:r>
+        <w:rPr>
+          <w:rFonts w:ascii="Consolas" w:hAnsi="Consolas"/>
+          <w:color w:val="D16969"/>
+          <w:sz w:val="21"/>
+          <w:szCs w:val="21"/>
+          <w:lang w:val="en-US" w:eastAsia="en-US"/>
+        </w:rPr>
+        <w:t>]</w:t>
+      </w:r>
+      <w:r>
+        <w:rPr>
+          <w:rFonts w:ascii="Consolas" w:hAnsi="Consolas"/>
+          <w:color w:val="000000"/>
+          <w:sz w:val="21"/>
+          <w:szCs w:val="21"/>
+          <w:lang w:val="en-US" w:eastAsia="en-US"/>
+        </w:rPr>
+        <w:t>{1,4}</w:t>
+      </w:r>
+      <w:r>
+        <w:rPr>
+          <w:rFonts w:ascii="Consolas" w:hAnsi="Consolas"/>
+          <w:color w:val="811F3F"/>
+          <w:sz w:val="21"/>
+          <w:szCs w:val="21"/>
+          <w:lang w:val="en-US" w:eastAsia="en-US"/>
+        </w:rPr>
+        <w:t xml:space="preserve"> </w:t>
+      </w:r>
+      <w:r>
+        <w:rPr>
+          <w:rFonts w:ascii="Consolas" w:hAnsi="Consolas"/>
+          <w:color w:val="D16969"/>
+          <w:sz w:val="21"/>
+          <w:szCs w:val="21"/>
+          <w:lang w:val="en-US" w:eastAsia="en-US"/>
+        </w:rPr>
+        <w:t>)</w:t>
+      </w:r>
+      <w:r>
+        <w:rPr>
+          <w:rFonts w:ascii="Consolas" w:hAnsi="Consolas"/>
+          <w:color w:val="000000"/>
+          <w:sz w:val="21"/>
+          <w:szCs w:val="21"/>
+          <w:lang w:val="en-US" w:eastAsia="en-US"/>
+        </w:rPr>
+        <w:t>?</w:t>
+      </w:r>
+      <w:r>
+        <w:rPr>
+          <w:rFonts w:ascii="Consolas" w:hAnsi="Consolas"/>
+          <w:color w:val="D16969"/>
+          <w:sz w:val="21"/>
+          <w:szCs w:val="21"/>
+          <w:lang w:val="en-US" w:eastAsia="en-US"/>
+        </w:rPr>
+        <w:t>([</w:t>
+      </w:r>
+      <w:r>
+        <w:rPr>
+          <w:rFonts w:ascii="Consolas" w:hAnsi="Consolas"/>
+          <w:color w:val="811F3F"/>
+          <w:sz w:val="21"/>
+          <w:szCs w:val="21"/>
+          <w:lang w:val="en-US" w:eastAsia="en-US"/>
+        </w:rPr>
+        <w:t>0-9</w:t>
+      </w:r>
+      <w:r>
+        <w:rPr>
+          <w:rFonts w:ascii="Consolas" w:hAnsi="Consolas"/>
+          <w:color w:val="D16969"/>
+          <w:sz w:val="21"/>
+          <w:szCs w:val="21"/>
+          <w:lang w:val="en-US" w:eastAsia="en-US"/>
+        </w:rPr>
+        <w:t>]</w:t>
+      </w:r>
+      <w:r>
+        <w:rPr>
+          <w:rFonts w:ascii="Consolas" w:hAnsi="Consolas"/>
+          <w:color w:val="000000"/>
+          <w:sz w:val="21"/>
+          <w:szCs w:val="21"/>
+          <w:lang w:val="en-US" w:eastAsia="en-US"/>
+        </w:rPr>
+        <w:t>{3}</w:t>
+      </w:r>
+      <w:r>
+        <w:rPr>
+          <w:rFonts w:ascii="Consolas" w:hAnsi="Consolas"/>
+          <w:color w:val="811F3F"/>
+          <w:sz w:val="21"/>
+          <w:szCs w:val="21"/>
+          <w:lang w:val="en-US" w:eastAsia="en-US"/>
+        </w:rPr>
+        <w:t xml:space="preserve"> </w:t>
+      </w:r>
+      <w:r>
+        <w:rPr>
+          <w:rFonts w:ascii="Consolas" w:hAnsi="Consolas"/>
+          <w:color w:val="D16969"/>
+          <w:sz w:val="21"/>
+          <w:szCs w:val="21"/>
+          <w:lang w:val="en-US" w:eastAsia="en-US"/>
+        </w:rPr>
+        <w:t>)</w:t>
+      </w:r>
+      <w:r>
+        <w:rPr>
+          <w:rFonts w:ascii="Consolas" w:hAnsi="Consolas"/>
+          <w:color w:val="000000"/>
+          <w:sz w:val="21"/>
+          <w:szCs w:val="21"/>
+          <w:lang w:val="en-US" w:eastAsia="en-US"/>
+        </w:rPr>
+        <w:t>{2}</w:t>
+      </w:r>
+      <w:r>
+        <w:rPr>
+          <w:rFonts w:ascii="Consolas" w:hAnsi="Consolas"/>
+          <w:color w:val="D16969"/>
+          <w:sz w:val="21"/>
+          <w:szCs w:val="21"/>
+          <w:lang w:val="en-US" w:eastAsia="en-US"/>
+        </w:rPr>
+        <w:t>[</w:t>
+      </w:r>
+      <w:r>
+        <w:rPr>
+          <w:rFonts w:ascii="Consolas" w:hAnsi="Consolas"/>
+          <w:color w:val="811F3F"/>
+          <w:sz w:val="21"/>
+          <w:szCs w:val="21"/>
+          <w:lang w:val="en-US" w:eastAsia="en-US"/>
+        </w:rPr>
+        <w:t>0-9</w:t>
+      </w:r>
+      <w:r>
+        <w:rPr>
+          <w:rFonts w:ascii="Consolas" w:hAnsi="Consolas"/>
+          <w:color w:val="D16969"/>
+          <w:sz w:val="21"/>
+          <w:szCs w:val="21"/>
+          <w:lang w:val="en-US" w:eastAsia="en-US"/>
+        </w:rPr>
+        <w:t>]</w:t>
+      </w:r>
+      <w:r>
+        <w:rPr>
+          <w:rFonts w:ascii="Consolas" w:hAnsi="Consolas"/>
+          <w:color w:val="000000"/>
+          <w:sz w:val="21"/>
+          <w:szCs w:val="21"/>
+          <w:lang w:val="en-US" w:eastAsia="en-US"/>
+        </w:rPr>
+        <w:t>{3}</w:t>
+      </w:r>
+      <w:r>
+        <w:rPr>
+          <w:rFonts w:ascii="Consolas" w:hAnsi="Consolas"/>
+          <w:color w:val="EE0000"/>
+          <w:sz w:val="21"/>
+          <w:szCs w:val="21"/>
+          <w:lang w:val="en-US" w:eastAsia="en-US"/>
+        </w:rPr>
+        <w:t>$</w:t>
+      </w:r>
+      <w:r>
+        <w:rPr>
+          <w:rFonts w:ascii="Consolas" w:hAnsi="Consolas"/>
+          <w:color w:val="D16969"/>
+          <w:sz w:val="21"/>
+          <w:szCs w:val="21"/>
+          <w:lang w:val="en-US" w:eastAsia="en-US"/>
+        </w:rPr>
+        <w:t>)</w:t>
+      </w:r>
+      <w:r>
+        <w:rPr>
+          <w:rFonts w:ascii="Consolas" w:hAnsi="Consolas"/>
+          <w:color w:val="EE0000"/>
+          <w:sz w:val="21"/>
+          <w:szCs w:val="21"/>
+          <w:lang w:val="en-US" w:eastAsia="en-US"/>
+        </w:rPr>
+        <w:t>|</w:t>
+      </w:r>
+      <w:r>
+        <w:rPr>
+          <w:rFonts w:ascii="Consolas" w:hAnsi="Consolas"/>
+          <w:color w:val="D16969"/>
+          <w:sz w:val="21"/>
+          <w:szCs w:val="21"/>
+          <w:lang w:val="en-US" w:eastAsia="en-US"/>
+        </w:rPr>
+        <w:t>(</w:t>
+      </w:r>
+      <w:r>
+        <w:rPr>
+          <w:rFonts w:ascii="Consolas" w:hAnsi="Consolas"/>
+          <w:color w:val="EE0000"/>
+          <w:sz w:val="21"/>
+          <w:szCs w:val="21"/>
+          <w:lang w:val="en-US" w:eastAsia="en-US"/>
+        </w:rPr>
+        <w:t>^</w:t>
+      </w:r>
+      <w:r>
+        <w:rPr>
+          <w:rFonts w:ascii="Consolas" w:hAnsi="Consolas"/>
+          <w:color w:val="D16969"/>
+          <w:sz w:val="21"/>
+          <w:szCs w:val="21"/>
+          <w:lang w:val="en-US" w:eastAsia="en-US"/>
+        </w:rPr>
+        <w:t>(</w:t>
+      </w:r>
+      <w:r>
+        <w:rPr>
+          <w:rFonts w:ascii="Consolas" w:hAnsi="Consolas"/>
+          <w:color w:val="EE0000"/>
+          <w:sz w:val="21"/>
+          <w:szCs w:val="21"/>
+          <w:lang w:val="en-US" w:eastAsia="en-US"/>
+        </w:rPr>
+        <w:t>\+</w:t>
+      </w:r>
+      <w:r>
+        <w:rPr>
+          <w:rFonts w:ascii="Consolas" w:hAnsi="Consolas"/>
+          <w:color w:val="D16969"/>
+          <w:sz w:val="21"/>
+          <w:szCs w:val="21"/>
+          <w:lang w:val="en-US" w:eastAsia="en-US"/>
+        </w:rPr>
+        <w:t>[</w:t>
+      </w:r>
+      <w:r>
+        <w:rPr>
+          <w:rFonts w:ascii="Consolas" w:hAnsi="Consolas"/>
+          <w:color w:val="811F3F"/>
+          <w:sz w:val="21"/>
+          <w:szCs w:val="21"/>
+          <w:lang w:val="en-US" w:eastAsia="en-US"/>
+        </w:rPr>
+        <w:t>0-9</w:t>
+      </w:r>
+      <w:r>
+        <w:rPr>
+          <w:rFonts w:ascii="Consolas" w:hAnsi="Consolas"/>
+          <w:color w:val="D16969"/>
+          <w:sz w:val="21"/>
+          <w:szCs w:val="21"/>
+          <w:lang w:val="en-US" w:eastAsia="en-US"/>
+        </w:rPr>
+        <w:t>]</w:t>
+      </w:r>
+      <w:r>
+        <w:rPr>
+          <w:rFonts w:ascii="Consolas" w:hAnsi="Consolas"/>
+          <w:color w:val="000000"/>
+          <w:sz w:val="21"/>
+          <w:szCs w:val="21"/>
+          <w:lang w:val="en-US" w:eastAsia="en-US"/>
+        </w:rPr>
+        <w:t>{1,4}</w:t>
+      </w:r>
+      <w:r>
+        <w:rPr>
+          <w:rFonts w:ascii="Consolas" w:hAnsi="Consolas"/>
+          <w:color w:val="D16969"/>
+          <w:sz w:val="21"/>
+          <w:szCs w:val="21"/>
+          <w:lang w:val="en-US" w:eastAsia="en-US"/>
+        </w:rPr>
+        <w:t>)</w:t>
+      </w:r>
+      <w:r>
+        <w:rPr>
+          <w:rFonts w:ascii="Consolas" w:hAnsi="Consolas"/>
+          <w:color w:val="000000"/>
+          <w:sz w:val="21"/>
+          <w:szCs w:val="21"/>
+          <w:lang w:val="en-US" w:eastAsia="en-US"/>
+        </w:rPr>
+        <w:t>?</w:t>
+      </w:r>
+      <w:r>
+        <w:rPr>
+          <w:rFonts w:ascii="Consolas" w:hAnsi="Consolas"/>
+          <w:color w:val="D16969"/>
+          <w:sz w:val="21"/>
+          <w:szCs w:val="21"/>
+          <w:lang w:val="en-US" w:eastAsia="en-US"/>
+        </w:rPr>
+        <w:t>[</w:t>
+      </w:r>
+      <w:r>
+        <w:rPr>
+          <w:rFonts w:ascii="Consolas" w:hAnsi="Consolas"/>
+          <w:color w:val="811F3F"/>
+          <w:sz w:val="21"/>
+          <w:szCs w:val="21"/>
+          <w:lang w:val="en-US" w:eastAsia="en-US"/>
+        </w:rPr>
+        <w:t>0-9</w:t>
+      </w:r>
+      <w:r>
+        <w:rPr>
+          <w:rFonts w:ascii="Consolas" w:hAnsi="Consolas"/>
+          <w:color w:val="D16969"/>
+          <w:sz w:val="21"/>
+          <w:szCs w:val="21"/>
+          <w:lang w:val="en-US" w:eastAsia="en-US"/>
+        </w:rPr>
+        <w:t>]</w:t>
+      </w:r>
+      <w:r>
+        <w:rPr>
+          <w:rFonts w:ascii="Consolas" w:hAnsi="Consolas"/>
+          <w:color w:val="000000"/>
+          <w:sz w:val="21"/>
+          <w:szCs w:val="21"/>
+          <w:lang w:val="en-US" w:eastAsia="en-US"/>
+        </w:rPr>
+        <w:t>{9}</w:t>
+      </w:r>
+      <w:r>
+        <w:rPr>
+          <w:rFonts w:ascii="Consolas" w:hAnsi="Consolas"/>
+          <w:color w:val="EE0000"/>
+          <w:sz w:val="21"/>
+          <w:szCs w:val="21"/>
+          <w:lang w:val="en-US" w:eastAsia="en-US"/>
+        </w:rPr>
+        <w:t>$</w:t>
+      </w:r>
+      <w:r>
+        <w:rPr>
+          <w:rFonts w:ascii="Consolas" w:hAnsi="Consolas"/>
+          <w:color w:val="D16969"/>
+          <w:sz w:val="21"/>
+          <w:szCs w:val="21"/>
+          <w:lang w:val="en-US" w:eastAsia="en-US"/>
+        </w:rPr>
+        <w:t>)</w:t>
+      </w:r>
+      <w:r>
+        <w:rPr>
+          <w:rFonts w:ascii="Consolas" w:hAnsi="Consolas"/>
+          <w:color w:val="811F3F"/>
+          <w:sz w:val="21"/>
+          <w:szCs w:val="21"/>
+          <w:lang w:val="en-US" w:eastAsia="en-US"/>
+        </w:rPr>
+        <w:t>/</w:t>
+      </w:r>
+    </w:p>
+    <w:p>
+      <w:pPr>
+        <w:shd w:val="clear" w:color="auto" w:fill="FFFFFF"/>
+        <w:spacing w:before="0" w:after="0" w:line="285" w:lineRule="atLeast"/>
+        <w:ind w:firstLine="0"/>
+        <w:jc w:val="left"/>
+        <w:rPr>
+          <w:rFonts w:ascii="Consolas" w:hAnsi="Consolas"/>
+          <w:color w:val="000000"/>
+          <w:sz w:val="21"/>
+          <w:szCs w:val="21"/>
+          <w:lang w:val="en-US" w:eastAsia="en-US"/>
+        </w:rPr>
+      </w:pPr>
+      <w:r>
+        <w:rPr>
+          <w:rFonts w:ascii="Consolas" w:hAnsi="Consolas"/>
+          <w:color w:val="000000"/>
+          <w:sz w:val="21"/>
+          <w:szCs w:val="21"/>
+          <w:lang w:val="en-US" w:eastAsia="en-US"/>
+        </w:rPr>
+        <w:t xml:space="preserve">    </w:t>
+      </w:r>
+      <w:r>
+        <w:rPr>
+          <w:rFonts w:ascii="Consolas" w:hAnsi="Consolas"/>
+          <w:color w:val="0000FF"/>
+          <w:sz w:val="21"/>
+          <w:szCs w:val="21"/>
+          <w:lang w:val="en-US" w:eastAsia="en-US"/>
+        </w:rPr>
+        <w:t>let</w:t>
+      </w:r>
+      <w:r>
+        <w:rPr>
+          <w:rFonts w:ascii="Consolas" w:hAnsi="Consolas"/>
+          <w:color w:val="000000"/>
+          <w:sz w:val="21"/>
+          <w:szCs w:val="21"/>
+          <w:lang w:val="en-US" w:eastAsia="en-US"/>
+        </w:rPr>
+        <w:t xml:space="preserve"> </w:t>
+      </w:r>
+      <w:r>
+        <w:rPr>
+          <w:rFonts w:ascii="Consolas" w:hAnsi="Consolas"/>
+          <w:color w:val="001080"/>
+          <w:sz w:val="21"/>
+          <w:szCs w:val="21"/>
+          <w:lang w:val="en-US" w:eastAsia="en-US"/>
+        </w:rPr>
+        <w:t>hesloRegex</w:t>
+      </w:r>
+      <w:r>
+        <w:rPr>
+          <w:rFonts w:ascii="Consolas" w:hAnsi="Consolas"/>
+          <w:color w:val="000000"/>
+          <w:sz w:val="21"/>
+          <w:szCs w:val="21"/>
+          <w:lang w:val="en-US" w:eastAsia="en-US"/>
+        </w:rPr>
+        <w:t xml:space="preserve"> =</w:t>
+      </w:r>
+      <w:r>
+        <w:rPr>
+          <w:rFonts w:ascii="Consolas" w:hAnsi="Consolas"/>
+          <w:color w:val="811F3F"/>
+          <w:sz w:val="21"/>
+          <w:szCs w:val="21"/>
+          <w:lang w:val="en-US" w:eastAsia="en-US"/>
+        </w:rPr>
+        <w:t xml:space="preserve"> /</w:t>
+      </w:r>
+      <w:r>
+        <w:rPr>
+          <w:rFonts w:ascii="Consolas" w:hAnsi="Consolas"/>
+          <w:color w:val="EE0000"/>
+          <w:sz w:val="21"/>
+          <w:szCs w:val="21"/>
+          <w:lang w:val="en-US" w:eastAsia="en-US"/>
+        </w:rPr>
+        <w:t>^</w:t>
+      </w:r>
+      <w:r>
+        <w:rPr>
+          <w:rFonts w:ascii="Consolas" w:hAnsi="Consolas"/>
+          <w:color w:val="D16969"/>
+          <w:sz w:val="21"/>
+          <w:szCs w:val="21"/>
+          <w:lang w:val="en-US" w:eastAsia="en-US"/>
+        </w:rPr>
+        <w:t>(?=</w:t>
+      </w:r>
+      <w:r>
+        <w:rPr>
+          <w:rFonts w:ascii="Consolas" w:hAnsi="Consolas"/>
+          <w:color w:val="811F3F"/>
+          <w:sz w:val="21"/>
+          <w:szCs w:val="21"/>
+          <w:lang w:val="en-US" w:eastAsia="en-US"/>
+        </w:rPr>
+        <w:t>.</w:t>
+      </w:r>
+      <w:r>
+        <w:rPr>
+          <w:rFonts w:ascii="Consolas" w:hAnsi="Consolas"/>
+          <w:color w:val="000000"/>
+          <w:sz w:val="21"/>
+          <w:szCs w:val="21"/>
+          <w:lang w:val="en-US" w:eastAsia="en-US"/>
+        </w:rPr>
+        <w:t>*</w:t>
+      </w:r>
+      <w:r>
+        <w:rPr>
+          <w:rFonts w:ascii="Consolas" w:hAnsi="Consolas"/>
+          <w:color w:val="D16969"/>
+          <w:sz w:val="21"/>
+          <w:szCs w:val="21"/>
+          <w:lang w:val="en-US" w:eastAsia="en-US"/>
+        </w:rPr>
+        <w:t>[</w:t>
+      </w:r>
+      <w:r>
+        <w:rPr>
+          <w:rFonts w:ascii="Consolas" w:hAnsi="Consolas"/>
+          <w:color w:val="811F3F"/>
+          <w:sz w:val="21"/>
+          <w:szCs w:val="21"/>
+          <w:lang w:val="en-US" w:eastAsia="en-US"/>
+        </w:rPr>
+        <w:t>A-Z</w:t>
+      </w:r>
+      <w:r>
+        <w:rPr>
+          <w:rFonts w:ascii="Consolas" w:hAnsi="Consolas"/>
+          <w:color w:val="D16969"/>
+          <w:sz w:val="21"/>
+          <w:szCs w:val="21"/>
+          <w:lang w:val="en-US" w:eastAsia="en-US"/>
+        </w:rPr>
+        <w:t>])(?=</w:t>
+      </w:r>
+      <w:r>
+        <w:rPr>
+          <w:rFonts w:ascii="Consolas" w:hAnsi="Consolas"/>
+          <w:color w:val="811F3F"/>
+          <w:sz w:val="21"/>
+          <w:szCs w:val="21"/>
+          <w:lang w:val="en-US" w:eastAsia="en-US"/>
+        </w:rPr>
+        <w:t>.</w:t>
+      </w:r>
+      <w:r>
+        <w:rPr>
+          <w:rFonts w:ascii="Consolas" w:hAnsi="Consolas"/>
+          <w:color w:val="000000"/>
+          <w:sz w:val="21"/>
+          <w:szCs w:val="21"/>
+          <w:lang w:val="en-US" w:eastAsia="en-US"/>
+        </w:rPr>
+        <w:t>*</w:t>
+      </w:r>
+      <w:r>
+        <w:rPr>
+          <w:rFonts w:ascii="Consolas" w:hAnsi="Consolas"/>
+          <w:color w:val="D16969"/>
+          <w:sz w:val="21"/>
+          <w:szCs w:val="21"/>
+          <w:lang w:val="en-US" w:eastAsia="en-US"/>
+        </w:rPr>
+        <w:t>[</w:t>
+      </w:r>
+      <w:r>
+        <w:rPr>
+          <w:rFonts w:ascii="Consolas" w:hAnsi="Consolas"/>
+          <w:color w:val="811F3F"/>
+          <w:sz w:val="21"/>
+          <w:szCs w:val="21"/>
+          <w:lang w:val="en-US" w:eastAsia="en-US"/>
+        </w:rPr>
+        <w:t>a-z</w:t>
+      </w:r>
+      <w:r>
+        <w:rPr>
+          <w:rFonts w:ascii="Consolas" w:hAnsi="Consolas"/>
+          <w:color w:val="D16969"/>
+          <w:sz w:val="21"/>
+          <w:szCs w:val="21"/>
+          <w:lang w:val="en-US" w:eastAsia="en-US"/>
+        </w:rPr>
+        <w:t>])(?=</w:t>
+      </w:r>
+      <w:r>
+        <w:rPr>
+          <w:rFonts w:ascii="Consolas" w:hAnsi="Consolas"/>
+          <w:color w:val="811F3F"/>
+          <w:sz w:val="21"/>
+          <w:szCs w:val="21"/>
+          <w:lang w:val="en-US" w:eastAsia="en-US"/>
+        </w:rPr>
+        <w:t>.</w:t>
+      </w:r>
+      <w:r>
+        <w:rPr>
+          <w:rFonts w:ascii="Consolas" w:hAnsi="Consolas"/>
+          <w:color w:val="000000"/>
+          <w:sz w:val="21"/>
+          <w:szCs w:val="21"/>
+          <w:lang w:val="en-US" w:eastAsia="en-US"/>
+        </w:rPr>
+        <w:t>*</w:t>
+      </w:r>
+      <w:r>
+        <w:rPr>
+          <w:rFonts w:ascii="Consolas" w:hAnsi="Consolas"/>
+          <w:color w:val="811F3F"/>
+          <w:sz w:val="21"/>
+          <w:szCs w:val="21"/>
+          <w:lang w:val="en-US" w:eastAsia="en-US"/>
+        </w:rPr>
+        <w:t>\d</w:t>
+      </w:r>
+      <w:r>
+        <w:rPr>
+          <w:rFonts w:ascii="Consolas" w:hAnsi="Consolas"/>
+          <w:color w:val="D16969"/>
+          <w:sz w:val="21"/>
+          <w:szCs w:val="21"/>
+          <w:lang w:val="en-US" w:eastAsia="en-US"/>
+        </w:rPr>
+        <w:t>)(?=</w:t>
+      </w:r>
+      <w:r>
+        <w:rPr>
+          <w:rFonts w:ascii="Consolas" w:hAnsi="Consolas"/>
+          <w:color w:val="811F3F"/>
+          <w:sz w:val="21"/>
+          <w:szCs w:val="21"/>
+          <w:lang w:val="en-US" w:eastAsia="en-US"/>
+        </w:rPr>
+        <w:t>.</w:t>
+      </w:r>
+      <w:r>
+        <w:rPr>
+          <w:rFonts w:ascii="Consolas" w:hAnsi="Consolas"/>
+          <w:color w:val="000000"/>
+          <w:sz w:val="21"/>
+          <w:szCs w:val="21"/>
+          <w:lang w:val="en-US" w:eastAsia="en-US"/>
+        </w:rPr>
+        <w:t>*</w:t>
+      </w:r>
+      <w:r>
+        <w:rPr>
+          <w:rFonts w:ascii="Consolas" w:hAnsi="Consolas"/>
+          <w:color w:val="D16969"/>
+          <w:sz w:val="21"/>
+          <w:szCs w:val="21"/>
+          <w:lang w:val="en-US" w:eastAsia="en-US"/>
+        </w:rPr>
+        <w:t>[^</w:t>
+      </w:r>
+      <w:r>
+        <w:rPr>
+          <w:rFonts w:ascii="Consolas" w:hAnsi="Consolas"/>
+          <w:color w:val="811F3F"/>
+          <w:sz w:val="21"/>
+          <w:szCs w:val="21"/>
+          <w:lang w:val="en-US" w:eastAsia="en-US"/>
+        </w:rPr>
+        <w:t>A-Za-z\d\s</w:t>
+      </w:r>
+      <w:r>
+        <w:rPr>
+          <w:rFonts w:ascii="Consolas" w:hAnsi="Consolas"/>
+          <w:color w:val="D16969"/>
+          <w:sz w:val="21"/>
+          <w:szCs w:val="21"/>
+          <w:lang w:val="en-US" w:eastAsia="en-US"/>
+        </w:rPr>
+        <w:t>])[</w:t>
+      </w:r>
+      <w:r>
+        <w:rPr>
+          <w:rFonts w:ascii="Consolas" w:hAnsi="Consolas"/>
+          <w:color w:val="811F3F"/>
+          <w:sz w:val="21"/>
+          <w:szCs w:val="21"/>
+          <w:lang w:val="en-US" w:eastAsia="en-US"/>
+        </w:rPr>
+        <w:t>A-Za-z\d\W\S</w:t>
+      </w:r>
+      <w:r>
+        <w:rPr>
+          <w:rFonts w:ascii="Consolas" w:hAnsi="Consolas"/>
+          <w:color w:val="D16969"/>
+          <w:sz w:val="21"/>
+          <w:szCs w:val="21"/>
+          <w:lang w:val="en-US" w:eastAsia="en-US"/>
+        </w:rPr>
+        <w:t>]</w:t>
+      </w:r>
+      <w:r>
+        <w:rPr>
+          <w:rFonts w:ascii="Consolas" w:hAnsi="Consolas"/>
+          <w:color w:val="000000"/>
+          <w:sz w:val="21"/>
+          <w:szCs w:val="21"/>
+          <w:lang w:val="en-US" w:eastAsia="en-US"/>
+        </w:rPr>
+        <w:t>{8,}</w:t>
+      </w:r>
+      <w:r>
+        <w:rPr>
+          <w:rFonts w:ascii="Consolas" w:hAnsi="Consolas"/>
+          <w:color w:val="EE0000"/>
+          <w:sz w:val="21"/>
+          <w:szCs w:val="21"/>
+          <w:lang w:val="en-US" w:eastAsia="en-US"/>
+        </w:rPr>
+        <w:t>$</w:t>
+      </w:r>
+      <w:r>
+        <w:rPr>
+          <w:rFonts w:ascii="Consolas" w:hAnsi="Consolas"/>
+          <w:color w:val="811F3F"/>
+          <w:sz w:val="21"/>
+          <w:szCs w:val="21"/>
+          <w:lang w:val="en-US" w:eastAsia="en-US"/>
+        </w:rPr>
+        <w:t>/</w:t>
+      </w:r>
+    </w:p>
+    <w:p>
+      <w:pPr>
+        <w:shd w:val="clear" w:color="auto" w:fill="FFFFFF"/>
+        <w:spacing w:before="0" w:after="0" w:line="285" w:lineRule="atLeast"/>
+        <w:ind w:firstLine="0"/>
+        <w:jc w:val="left"/>
+        <w:rPr>
+          <w:rFonts w:ascii="Consolas" w:hAnsi="Consolas"/>
+          <w:color w:val="000000"/>
+          <w:sz w:val="21"/>
+          <w:szCs w:val="21"/>
+          <w:lang w:val="en-US" w:eastAsia="en-US"/>
+        </w:rPr>
+      </w:pPr>
+      <w:r>
+        <w:rPr>
+          <w:rFonts w:ascii="Consolas" w:hAnsi="Consolas"/>
+          <w:color w:val="000000"/>
+          <w:sz w:val="21"/>
+          <w:szCs w:val="21"/>
+          <w:lang w:val="en-US" w:eastAsia="en-US"/>
+        </w:rPr>
+        <w:t xml:space="preserve">    </w:t>
+      </w:r>
+      <w:r>
+        <w:rPr>
+          <w:rFonts w:ascii="Consolas" w:hAnsi="Consolas"/>
+          <w:color w:val="0000FF"/>
+          <w:sz w:val="21"/>
+          <w:szCs w:val="21"/>
+          <w:lang w:val="en-US" w:eastAsia="en-US"/>
+        </w:rPr>
+        <w:t>let</w:t>
+      </w:r>
+      <w:r>
+        <w:rPr>
+          <w:rFonts w:ascii="Consolas" w:hAnsi="Consolas"/>
+          <w:color w:val="000000"/>
+          <w:sz w:val="21"/>
+          <w:szCs w:val="21"/>
+          <w:lang w:val="en-US" w:eastAsia="en-US"/>
+        </w:rPr>
+        <w:t xml:space="preserve"> </w:t>
+      </w:r>
+      <w:r>
+        <w:rPr>
+          <w:rFonts w:ascii="Consolas" w:hAnsi="Consolas"/>
+          <w:color w:val="001080"/>
+          <w:sz w:val="21"/>
+          <w:szCs w:val="21"/>
+          <w:lang w:val="en-US" w:eastAsia="en-US"/>
+        </w:rPr>
+        <w:t>emailRegex</w:t>
+      </w:r>
+      <w:r>
+        <w:rPr>
+          <w:rFonts w:ascii="Consolas" w:hAnsi="Consolas"/>
+          <w:color w:val="000000"/>
+          <w:sz w:val="21"/>
+          <w:szCs w:val="21"/>
+          <w:lang w:val="en-US" w:eastAsia="en-US"/>
+        </w:rPr>
+        <w:t xml:space="preserve"> =</w:t>
+      </w:r>
+      <w:r>
+        <w:rPr>
+          <w:rFonts w:ascii="Consolas" w:hAnsi="Consolas"/>
+          <w:color w:val="811F3F"/>
+          <w:sz w:val="21"/>
+          <w:szCs w:val="21"/>
+          <w:lang w:val="en-US" w:eastAsia="en-US"/>
+        </w:rPr>
+        <w:t xml:space="preserve"> /</w:t>
+      </w:r>
+      <w:r>
+        <w:rPr>
+          <w:rFonts w:ascii="Consolas" w:hAnsi="Consolas"/>
+          <w:color w:val="EE0000"/>
+          <w:sz w:val="21"/>
+          <w:szCs w:val="21"/>
+          <w:lang w:val="en-US" w:eastAsia="en-US"/>
+        </w:rPr>
+        <w:t>^</w:t>
+      </w:r>
+      <w:r>
+        <w:rPr>
+          <w:rFonts w:ascii="Consolas" w:hAnsi="Consolas"/>
+          <w:color w:val="D16969"/>
+          <w:sz w:val="21"/>
+          <w:szCs w:val="21"/>
+          <w:lang w:val="en-US" w:eastAsia="en-US"/>
+        </w:rPr>
+        <w:t>[</w:t>
+      </w:r>
+      <w:r>
+        <w:rPr>
+          <w:rFonts w:ascii="Consolas" w:hAnsi="Consolas"/>
+          <w:color w:val="811F3F"/>
+          <w:sz w:val="21"/>
+          <w:szCs w:val="21"/>
+          <w:lang w:val="en-US" w:eastAsia="en-US"/>
+        </w:rPr>
+        <w:t>a-zA-Z0-9</w:t>
+      </w:r>
+      <w:r>
+        <w:rPr>
+          <w:rFonts w:ascii="Consolas" w:hAnsi="Consolas"/>
+          <w:color w:val="D16969"/>
+          <w:sz w:val="21"/>
+          <w:szCs w:val="21"/>
+          <w:lang w:val="en-US" w:eastAsia="en-US"/>
+        </w:rPr>
+        <w:t>]</w:t>
+      </w:r>
+      <w:r>
+        <w:rPr>
+          <w:rFonts w:ascii="Consolas" w:hAnsi="Consolas"/>
+          <w:color w:val="000000"/>
+          <w:sz w:val="21"/>
+          <w:szCs w:val="21"/>
+          <w:lang w:val="en-US" w:eastAsia="en-US"/>
+        </w:rPr>
+        <w:t>+</w:t>
+      </w:r>
+      <w:r>
+        <w:rPr>
+          <w:rFonts w:ascii="Consolas" w:hAnsi="Consolas"/>
+          <w:color w:val="811F3F"/>
+          <w:sz w:val="21"/>
+          <w:szCs w:val="21"/>
+          <w:lang w:val="en-US" w:eastAsia="en-US"/>
+        </w:rPr>
+        <w:t>@</w:t>
+      </w:r>
+      <w:r>
+        <w:rPr>
+          <w:rFonts w:ascii="Consolas" w:hAnsi="Consolas"/>
+          <w:color w:val="D16969"/>
+          <w:sz w:val="21"/>
+          <w:szCs w:val="21"/>
+          <w:lang w:val="en-US" w:eastAsia="en-US"/>
+        </w:rPr>
+        <w:t>[</w:t>
+      </w:r>
+      <w:r>
+        <w:rPr>
+          <w:rFonts w:ascii="Consolas" w:hAnsi="Consolas"/>
+          <w:color w:val="811F3F"/>
+          <w:sz w:val="21"/>
+          <w:szCs w:val="21"/>
+          <w:lang w:val="en-US" w:eastAsia="en-US"/>
+        </w:rPr>
+        <w:t>a-zA-Z0-9</w:t>
+      </w:r>
+      <w:r>
+        <w:rPr>
+          <w:rFonts w:ascii="Consolas" w:hAnsi="Consolas"/>
+          <w:color w:val="D16969"/>
+          <w:sz w:val="21"/>
+          <w:szCs w:val="21"/>
+          <w:lang w:val="en-US" w:eastAsia="en-US"/>
+        </w:rPr>
+        <w:t>]</w:t>
+      </w:r>
+      <w:r>
+        <w:rPr>
+          <w:rFonts w:ascii="Consolas" w:hAnsi="Consolas"/>
+          <w:color w:val="000000"/>
+          <w:sz w:val="21"/>
+          <w:szCs w:val="21"/>
+          <w:lang w:val="en-US" w:eastAsia="en-US"/>
+        </w:rPr>
+        <w:t>+</w:t>
+      </w:r>
+      <w:r>
+        <w:rPr>
+          <w:rFonts w:ascii="Consolas" w:hAnsi="Consolas"/>
+          <w:color w:val="EE0000"/>
+          <w:sz w:val="21"/>
+          <w:szCs w:val="21"/>
+          <w:lang w:val="en-US" w:eastAsia="en-US"/>
+        </w:rPr>
+        <w:t>\.</w:t>
+      </w:r>
+      <w:r>
+        <w:rPr>
+          <w:rFonts w:ascii="Consolas" w:hAnsi="Consolas"/>
+          <w:color w:val="D16969"/>
+          <w:sz w:val="21"/>
+          <w:szCs w:val="21"/>
+          <w:lang w:val="en-US" w:eastAsia="en-US"/>
+        </w:rPr>
+        <w:t>[</w:t>
+      </w:r>
+      <w:r>
+        <w:rPr>
+          <w:rFonts w:ascii="Consolas" w:hAnsi="Consolas"/>
+          <w:color w:val="811F3F"/>
+          <w:sz w:val="21"/>
+          <w:szCs w:val="21"/>
+          <w:lang w:val="en-US" w:eastAsia="en-US"/>
+        </w:rPr>
+        <w:t>a-zA-Z</w:t>
+      </w:r>
+      <w:r>
+        <w:rPr>
+          <w:rFonts w:ascii="Consolas" w:hAnsi="Consolas"/>
+          <w:color w:val="D16969"/>
+          <w:sz w:val="21"/>
+          <w:szCs w:val="21"/>
+          <w:lang w:val="en-US" w:eastAsia="en-US"/>
+        </w:rPr>
+        <w:t>]</w:t>
+      </w:r>
+      <w:r>
+        <w:rPr>
+          <w:rFonts w:ascii="Consolas" w:hAnsi="Consolas"/>
+          <w:color w:val="000000"/>
+          <w:sz w:val="21"/>
+          <w:szCs w:val="21"/>
+          <w:lang w:val="en-US" w:eastAsia="en-US"/>
+        </w:rPr>
+        <w:t>{2,4}</w:t>
+      </w:r>
+      <w:r>
+        <w:rPr>
+          <w:rFonts w:ascii="Consolas" w:hAnsi="Consolas"/>
+          <w:color w:val="EE0000"/>
+          <w:sz w:val="21"/>
+          <w:szCs w:val="21"/>
+          <w:lang w:val="en-US" w:eastAsia="en-US"/>
+        </w:rPr>
+        <w:t>$</w:t>
+      </w:r>
+      <w:r>
+        <w:rPr>
+          <w:rFonts w:ascii="Consolas" w:hAnsi="Consolas"/>
+          <w:color w:val="811F3F"/>
+          <w:sz w:val="21"/>
+          <w:szCs w:val="21"/>
+          <w:lang w:val="en-US" w:eastAsia="en-US"/>
+        </w:rPr>
+        <w:t>/</w:t>
+      </w:r>
+      <w:r>
+        <w:rPr>
+          <w:rFonts w:ascii="Consolas" w:hAnsi="Consolas"/>
+          <w:color w:val="000000"/>
+          <w:sz w:val="21"/>
+          <w:szCs w:val="21"/>
+          <w:lang w:val="en-US" w:eastAsia="en-US"/>
+        </w:rPr>
+        <w:t xml:space="preserve"> </w:t>
+      </w:r>
+    </w:p>
+    <w:p>
+      <w:pPr>
+        <w:shd w:val="clear" w:color="auto" w:fill="FFFFFF"/>
+        <w:spacing w:before="0" w:after="0" w:line="285" w:lineRule="atLeast"/>
+        <w:ind w:firstLine="0"/>
+        <w:jc w:val="left"/>
+        <w:rPr>
+          <w:rFonts w:ascii="Consolas" w:hAnsi="Consolas"/>
+          <w:color w:val="000000"/>
+          <w:sz w:val="21"/>
+          <w:szCs w:val="21"/>
+          <w:lang w:val="en-US" w:eastAsia="en-US"/>
+        </w:rPr>
+      </w:pPr>
+    </w:p>
+    <w:p>
+      <w:pPr>
+        <w:shd w:val="clear" w:color="auto" w:fill="FFFFFF"/>
+        <w:spacing w:before="0" w:after="0" w:line="285" w:lineRule="atLeast"/>
+        <w:ind w:firstLine="0"/>
+        <w:jc w:val="left"/>
+        <w:rPr>
+          <w:rFonts w:ascii="Consolas" w:hAnsi="Consolas"/>
+          <w:color w:val="000000"/>
+          <w:sz w:val="21"/>
+          <w:szCs w:val="21"/>
+          <w:lang w:val="en-US" w:eastAsia="en-US"/>
+        </w:rPr>
+      </w:pPr>
+      <w:r>
+        <w:rPr>
+          <w:rFonts w:ascii="Consolas" w:hAnsi="Consolas"/>
+          <w:color w:val="000000"/>
+          <w:sz w:val="21"/>
+          <w:szCs w:val="21"/>
+          <w:lang w:val="en-US" w:eastAsia="en-US"/>
+        </w:rPr>
+        <w:t xml:space="preserve">    </w:t>
+      </w:r>
+      <w:r>
+        <w:rPr>
+          <w:rFonts w:ascii="Consolas" w:hAnsi="Consolas"/>
+          <w:color w:val="AF00DB"/>
+          <w:sz w:val="21"/>
+          <w:szCs w:val="21"/>
+          <w:lang w:val="en-US" w:eastAsia="en-US"/>
+        </w:rPr>
+        <w:t>if</w:t>
+      </w:r>
+      <w:r>
+        <w:rPr>
+          <w:rFonts w:ascii="Consolas" w:hAnsi="Consolas"/>
+          <w:color w:val="000000"/>
+          <w:sz w:val="21"/>
+          <w:szCs w:val="21"/>
+          <w:lang w:val="en-US" w:eastAsia="en-US"/>
+        </w:rPr>
+        <w:t>(</w:t>
+      </w:r>
+      <w:r>
+        <w:rPr>
+          <w:rFonts w:ascii="Consolas" w:hAnsi="Consolas"/>
+          <w:color w:val="001080"/>
+          <w:sz w:val="21"/>
+          <w:szCs w:val="21"/>
+          <w:lang w:val="en-US" w:eastAsia="en-US"/>
+        </w:rPr>
+        <w:t>validace</w:t>
+      </w:r>
+      <w:r>
+        <w:rPr>
+          <w:rFonts w:ascii="Consolas" w:hAnsi="Consolas"/>
+          <w:color w:val="000000"/>
+          <w:sz w:val="21"/>
+          <w:szCs w:val="21"/>
+          <w:lang w:val="en-US" w:eastAsia="en-US"/>
+        </w:rPr>
+        <w:t>) {</w:t>
+      </w:r>
+    </w:p>
+    <w:p>
+      <w:pPr>
+        <w:shd w:val="clear" w:color="auto" w:fill="FFFFFF"/>
+        <w:spacing w:before="0" w:after="0" w:line="285" w:lineRule="atLeast"/>
+        <w:ind w:firstLine="0"/>
+        <w:jc w:val="left"/>
+        <w:rPr>
+          <w:rFonts w:ascii="Consolas" w:hAnsi="Consolas"/>
+          <w:color w:val="000000"/>
+          <w:sz w:val="21"/>
+          <w:szCs w:val="21"/>
+          <w:lang w:val="en-US" w:eastAsia="en-US"/>
+        </w:rPr>
+      </w:pPr>
+      <w:r>
+        <w:rPr>
+          <w:rFonts w:ascii="Consolas" w:hAnsi="Consolas"/>
+          <w:color w:val="000000"/>
+          <w:sz w:val="21"/>
+          <w:szCs w:val="21"/>
+          <w:lang w:val="en-US" w:eastAsia="en-US"/>
+        </w:rPr>
+        <w:t xml:space="preserve">        </w:t>
+      </w:r>
+      <w:r>
+        <w:rPr>
+          <w:rFonts w:ascii="Consolas" w:hAnsi="Consolas"/>
+          <w:color w:val="AF00DB"/>
+          <w:sz w:val="21"/>
+          <w:szCs w:val="21"/>
+          <w:lang w:val="en-US" w:eastAsia="en-US"/>
+        </w:rPr>
+        <w:t>if</w:t>
+      </w:r>
+      <w:r>
+        <w:rPr>
+          <w:rFonts w:ascii="Consolas" w:hAnsi="Consolas"/>
+          <w:color w:val="000000"/>
+          <w:sz w:val="21"/>
+          <w:szCs w:val="21"/>
+          <w:lang w:val="en-US" w:eastAsia="en-US"/>
+        </w:rPr>
+        <w:t>(!</w:t>
+      </w:r>
+      <w:r>
+        <w:rPr>
+          <w:rFonts w:ascii="Consolas" w:hAnsi="Consolas"/>
+          <w:color w:val="001080"/>
+          <w:sz w:val="21"/>
+          <w:szCs w:val="21"/>
+          <w:lang w:val="en-US" w:eastAsia="en-US"/>
+        </w:rPr>
+        <w:t>emailRegex</w:t>
+      </w:r>
+      <w:r>
+        <w:rPr>
+          <w:rFonts w:ascii="Consolas" w:hAnsi="Consolas"/>
+          <w:color w:val="000000"/>
+          <w:sz w:val="21"/>
+          <w:szCs w:val="21"/>
+          <w:lang w:val="en-US" w:eastAsia="en-US"/>
+        </w:rPr>
+        <w:t>.</w:t>
+      </w:r>
+      <w:r>
+        <w:rPr>
+          <w:rFonts w:ascii="Consolas" w:hAnsi="Consolas"/>
+          <w:color w:val="795E26"/>
+          <w:sz w:val="21"/>
+          <w:szCs w:val="21"/>
+          <w:lang w:val="en-US" w:eastAsia="en-US"/>
+        </w:rPr>
+        <w:t>test</w:t>
+      </w:r>
+      <w:r>
+        <w:rPr>
+          <w:rFonts w:ascii="Consolas" w:hAnsi="Consolas"/>
+          <w:color w:val="000000"/>
+          <w:sz w:val="21"/>
+          <w:szCs w:val="21"/>
+          <w:lang w:val="en-US" w:eastAsia="en-US"/>
+        </w:rPr>
+        <w:t>(</w:t>
+      </w:r>
+      <w:r>
+        <w:rPr>
+          <w:rFonts w:ascii="Consolas" w:hAnsi="Consolas"/>
+          <w:color w:val="001080"/>
+          <w:sz w:val="21"/>
+          <w:szCs w:val="21"/>
+          <w:lang w:val="en-US" w:eastAsia="en-US"/>
+        </w:rPr>
+        <w:t>email</w:t>
+      </w:r>
+      <w:r>
+        <w:rPr>
+          <w:rFonts w:ascii="Consolas" w:hAnsi="Consolas"/>
+          <w:color w:val="000000"/>
+          <w:sz w:val="21"/>
+          <w:szCs w:val="21"/>
+          <w:lang w:val="en-US" w:eastAsia="en-US"/>
+        </w:rPr>
+        <w:t>.</w:t>
+      </w:r>
+      <w:r>
+        <w:rPr>
+          <w:rFonts w:ascii="Consolas" w:hAnsi="Consolas"/>
+          <w:color w:val="001080"/>
+          <w:sz w:val="21"/>
+          <w:szCs w:val="21"/>
+          <w:lang w:val="en-US" w:eastAsia="en-US"/>
+        </w:rPr>
+        <w:t>value</w:t>
+      </w:r>
+      <w:r>
+        <w:rPr>
+          <w:rFonts w:ascii="Consolas" w:hAnsi="Consolas"/>
+          <w:color w:val="000000"/>
+          <w:sz w:val="21"/>
+          <w:szCs w:val="21"/>
+          <w:lang w:val="en-US" w:eastAsia="en-US"/>
+        </w:rPr>
+        <w:t>)) {</w:t>
+      </w:r>
+    </w:p>
+    <w:p>
+      <w:pPr>
+        <w:shd w:val="clear" w:color="auto" w:fill="FFFFFF"/>
+        <w:spacing w:before="0" w:after="0" w:line="285" w:lineRule="atLeast"/>
+        <w:ind w:firstLine="0"/>
+        <w:jc w:val="left"/>
+        <w:rPr>
+          <w:rFonts w:ascii="Consolas" w:hAnsi="Consolas"/>
+          <w:color w:val="000000"/>
+          <w:sz w:val="21"/>
+          <w:szCs w:val="21"/>
+          <w:lang w:val="en-US" w:eastAsia="en-US"/>
+        </w:rPr>
+      </w:pPr>
+      <w:r>
+        <w:rPr>
+          <w:rFonts w:ascii="Consolas" w:hAnsi="Consolas"/>
+          <w:color w:val="000000"/>
+          <w:sz w:val="21"/>
+          <w:szCs w:val="21"/>
+          <w:lang w:val="en-US" w:eastAsia="en-US"/>
+        </w:rPr>
+        <w:t xml:space="preserve">            </w:t>
+      </w:r>
+      <w:r>
+        <w:rPr>
+          <w:rFonts w:ascii="Consolas" w:hAnsi="Consolas"/>
+          <w:color w:val="001080"/>
+          <w:sz w:val="21"/>
+          <w:szCs w:val="21"/>
+          <w:lang w:val="en-US" w:eastAsia="en-US"/>
+        </w:rPr>
+        <w:t>zprava</w:t>
+      </w:r>
+      <w:r>
+        <w:rPr>
+          <w:rFonts w:ascii="Consolas" w:hAnsi="Consolas"/>
+          <w:color w:val="000000"/>
+          <w:sz w:val="21"/>
+          <w:szCs w:val="21"/>
+          <w:lang w:val="en-US" w:eastAsia="en-US"/>
+        </w:rPr>
+        <w:t xml:space="preserve"> += </w:t>
+      </w:r>
+      <w:r>
+        <w:rPr>
+          <w:rFonts w:ascii="Consolas" w:hAnsi="Consolas"/>
+          <w:color w:val="A31515"/>
+          <w:sz w:val="21"/>
+          <w:szCs w:val="21"/>
+          <w:lang w:val="en-US" w:eastAsia="en-US"/>
+        </w:rPr>
+        <w:t>"špatně zadaný email, "</w:t>
+      </w:r>
+    </w:p>
+    <w:p>
+      <w:pPr>
+        <w:shd w:val="clear" w:color="auto" w:fill="FFFFFF"/>
+        <w:spacing w:before="0" w:after="0" w:line="285" w:lineRule="atLeast"/>
+        <w:ind w:firstLine="0"/>
+        <w:jc w:val="left"/>
+        <w:rPr>
+          <w:rFonts w:ascii="Consolas" w:hAnsi="Consolas"/>
+          <w:color w:val="000000"/>
+          <w:sz w:val="21"/>
+          <w:szCs w:val="21"/>
+          <w:lang w:val="en-US" w:eastAsia="en-US"/>
+        </w:rPr>
+      </w:pPr>
+      <w:r>
+        <w:rPr>
+          <w:rFonts w:ascii="Consolas" w:hAnsi="Consolas"/>
+          <w:color w:val="000000"/>
+          <w:sz w:val="21"/>
+          <w:szCs w:val="21"/>
+          <w:lang w:val="en-US" w:eastAsia="en-US"/>
+        </w:rPr>
+        <w:t xml:space="preserve">            </w:t>
+      </w:r>
+      <w:r>
+        <w:rPr>
+          <w:rFonts w:ascii="Consolas" w:hAnsi="Consolas"/>
+          <w:color w:val="001080"/>
+          <w:sz w:val="21"/>
+          <w:szCs w:val="21"/>
+          <w:lang w:val="en-US" w:eastAsia="en-US"/>
+        </w:rPr>
+        <w:t>validace</w:t>
+      </w:r>
+      <w:r>
+        <w:rPr>
+          <w:rFonts w:ascii="Consolas" w:hAnsi="Consolas"/>
+          <w:color w:val="000000"/>
+          <w:sz w:val="21"/>
+          <w:szCs w:val="21"/>
+          <w:lang w:val="en-US" w:eastAsia="en-US"/>
+        </w:rPr>
+        <w:t xml:space="preserve"> = </w:t>
+      </w:r>
+      <w:r>
+        <w:rPr>
+          <w:rFonts w:ascii="Consolas" w:hAnsi="Consolas"/>
+          <w:color w:val="0000FF"/>
+          <w:sz w:val="21"/>
+          <w:szCs w:val="21"/>
+          <w:lang w:val="en-US" w:eastAsia="en-US"/>
+        </w:rPr>
+        <w:t>false</w:t>
+      </w:r>
+    </w:p>
+    <w:p>
+      <w:pPr>
+        <w:shd w:val="clear" w:color="auto" w:fill="FFFFFF"/>
+        <w:spacing w:before="0" w:after="0" w:line="285" w:lineRule="atLeast"/>
+        <w:ind w:firstLine="0"/>
+        <w:jc w:val="left"/>
+        <w:rPr>
+          <w:rFonts w:ascii="Consolas" w:hAnsi="Consolas"/>
+          <w:color w:val="000000"/>
+          <w:sz w:val="21"/>
+          <w:szCs w:val="21"/>
+          <w:lang w:val="en-US" w:eastAsia="en-US"/>
+        </w:rPr>
+      </w:pPr>
+      <w:r>
+        <w:rPr>
+          <w:rFonts w:ascii="Consolas" w:hAnsi="Consolas"/>
+          <w:color w:val="000000"/>
+          <w:sz w:val="21"/>
+          <w:szCs w:val="21"/>
+          <w:lang w:val="en-US" w:eastAsia="en-US"/>
+        </w:rPr>
+        <w:t>        }</w:t>
+      </w:r>
+    </w:p>
+    <w:p>
+      <w:pPr>
+        <w:shd w:val="clear" w:color="auto" w:fill="FFFFFF"/>
+        <w:spacing w:before="0" w:after="0" w:line="285" w:lineRule="atLeast"/>
+        <w:ind w:firstLine="0"/>
+        <w:jc w:val="left"/>
+        <w:rPr>
+          <w:rFonts w:ascii="Consolas" w:hAnsi="Consolas"/>
+          <w:color w:val="000000"/>
+          <w:sz w:val="21"/>
+          <w:szCs w:val="21"/>
+          <w:lang w:val="en-US" w:eastAsia="en-US"/>
+        </w:rPr>
+      </w:pPr>
+      <w:r>
+        <w:rPr>
+          <w:rFonts w:ascii="Consolas" w:hAnsi="Consolas"/>
+          <w:color w:val="000000"/>
+          <w:sz w:val="21"/>
+          <w:szCs w:val="21"/>
+          <w:lang w:val="en-US" w:eastAsia="en-US"/>
+        </w:rPr>
+        <w:t xml:space="preserve">        </w:t>
+      </w:r>
+      <w:r>
+        <w:rPr>
+          <w:rFonts w:ascii="Consolas" w:hAnsi="Consolas"/>
+          <w:color w:val="AF00DB"/>
+          <w:sz w:val="21"/>
+          <w:szCs w:val="21"/>
+          <w:lang w:val="en-US" w:eastAsia="en-US"/>
+        </w:rPr>
+        <w:t>if</w:t>
+      </w:r>
+      <w:r>
+        <w:rPr>
+          <w:rFonts w:ascii="Consolas" w:hAnsi="Consolas"/>
+          <w:color w:val="000000"/>
+          <w:sz w:val="21"/>
+          <w:szCs w:val="21"/>
+          <w:lang w:val="en-US" w:eastAsia="en-US"/>
+        </w:rPr>
+        <w:t xml:space="preserve"> (!</w:t>
+      </w:r>
+      <w:r>
+        <w:rPr>
+          <w:rFonts w:ascii="Consolas" w:hAnsi="Consolas"/>
+          <w:color w:val="001080"/>
+          <w:sz w:val="21"/>
+          <w:szCs w:val="21"/>
+          <w:lang w:val="en-US" w:eastAsia="en-US"/>
+        </w:rPr>
+        <w:t>telefonniCisloRegex</w:t>
+      </w:r>
+      <w:r>
+        <w:rPr>
+          <w:rFonts w:ascii="Consolas" w:hAnsi="Consolas"/>
+          <w:color w:val="000000"/>
+          <w:sz w:val="21"/>
+          <w:szCs w:val="21"/>
+          <w:lang w:val="en-US" w:eastAsia="en-US"/>
+        </w:rPr>
+        <w:t>.</w:t>
+      </w:r>
+      <w:r>
+        <w:rPr>
+          <w:rFonts w:ascii="Consolas" w:hAnsi="Consolas"/>
+          <w:color w:val="795E26"/>
+          <w:sz w:val="21"/>
+          <w:szCs w:val="21"/>
+          <w:lang w:val="en-US" w:eastAsia="en-US"/>
+        </w:rPr>
+        <w:t>test</w:t>
+      </w:r>
+      <w:r>
+        <w:rPr>
+          <w:rFonts w:ascii="Consolas" w:hAnsi="Consolas"/>
+          <w:color w:val="000000"/>
+          <w:sz w:val="21"/>
+          <w:szCs w:val="21"/>
+          <w:lang w:val="en-US" w:eastAsia="en-US"/>
+        </w:rPr>
+        <w:t>(</w:t>
+      </w:r>
+      <w:r>
+        <w:rPr>
+          <w:rFonts w:ascii="Consolas" w:hAnsi="Consolas"/>
+          <w:color w:val="001080"/>
+          <w:sz w:val="21"/>
+          <w:szCs w:val="21"/>
+          <w:lang w:val="en-US" w:eastAsia="en-US"/>
+        </w:rPr>
+        <w:t>telefonniCislo</w:t>
+      </w:r>
+      <w:r>
+        <w:rPr>
+          <w:rFonts w:ascii="Consolas" w:hAnsi="Consolas"/>
+          <w:color w:val="000000"/>
+          <w:sz w:val="21"/>
+          <w:szCs w:val="21"/>
+          <w:lang w:val="en-US" w:eastAsia="en-US"/>
+        </w:rPr>
+        <w:t>.</w:t>
+      </w:r>
+      <w:r>
+        <w:rPr>
+          <w:rFonts w:ascii="Consolas" w:hAnsi="Consolas"/>
+          <w:color w:val="001080"/>
+          <w:sz w:val="21"/>
+          <w:szCs w:val="21"/>
+          <w:lang w:val="en-US" w:eastAsia="en-US"/>
+        </w:rPr>
+        <w:t>value</w:t>
+      </w:r>
+      <w:r>
+        <w:rPr>
+          <w:rFonts w:ascii="Consolas" w:hAnsi="Consolas"/>
+          <w:color w:val="000000"/>
+          <w:sz w:val="21"/>
+          <w:szCs w:val="21"/>
+          <w:lang w:val="en-US" w:eastAsia="en-US"/>
+        </w:rPr>
+        <w:t>)) {</w:t>
+      </w:r>
+    </w:p>
+    <w:p>
+      <w:pPr>
+        <w:shd w:val="clear" w:color="auto" w:fill="FFFFFF"/>
+        <w:spacing w:before="0" w:after="0" w:line="285" w:lineRule="atLeast"/>
+        <w:ind w:firstLine="0"/>
+        <w:jc w:val="left"/>
+        <w:rPr>
+          <w:rFonts w:ascii="Consolas" w:hAnsi="Consolas"/>
+          <w:color w:val="000000"/>
+          <w:sz w:val="21"/>
+          <w:szCs w:val="21"/>
+          <w:lang w:val="en-US" w:eastAsia="en-US"/>
+        </w:rPr>
+      </w:pPr>
+      <w:r>
+        <w:rPr>
+          <w:rFonts w:ascii="Consolas" w:hAnsi="Consolas"/>
+          <w:color w:val="000000"/>
+          <w:sz w:val="21"/>
+          <w:szCs w:val="21"/>
+          <w:lang w:val="en-US" w:eastAsia="en-US"/>
+        </w:rPr>
+        <w:t xml:space="preserve">            </w:t>
+      </w:r>
+      <w:r>
+        <w:rPr>
+          <w:rFonts w:ascii="Consolas" w:hAnsi="Consolas"/>
+          <w:color w:val="001080"/>
+          <w:sz w:val="21"/>
+          <w:szCs w:val="21"/>
+          <w:lang w:val="en-US" w:eastAsia="en-US"/>
+        </w:rPr>
+        <w:t>zprava</w:t>
+      </w:r>
+      <w:r>
+        <w:rPr>
+          <w:rFonts w:ascii="Consolas" w:hAnsi="Consolas"/>
+          <w:color w:val="000000"/>
+          <w:sz w:val="21"/>
+          <w:szCs w:val="21"/>
+          <w:lang w:val="en-US" w:eastAsia="en-US"/>
+        </w:rPr>
+        <w:t xml:space="preserve"> += </w:t>
+      </w:r>
+      <w:r>
+        <w:rPr>
+          <w:rFonts w:ascii="Consolas" w:hAnsi="Consolas"/>
+          <w:color w:val="A31515"/>
+          <w:sz w:val="21"/>
+          <w:szCs w:val="21"/>
+          <w:lang w:val="en-US" w:eastAsia="en-US"/>
+        </w:rPr>
+        <w:t>"špatně zadané telefonní číslo, "</w:t>
+      </w:r>
+    </w:p>
+    <w:p>
+      <w:pPr>
+        <w:shd w:val="clear" w:color="auto" w:fill="FFFFFF"/>
+        <w:spacing w:before="0" w:after="0" w:line="285" w:lineRule="atLeast"/>
+        <w:ind w:firstLine="0"/>
+        <w:jc w:val="left"/>
+        <w:rPr>
+          <w:rFonts w:ascii="Consolas" w:hAnsi="Consolas"/>
+          <w:color w:val="000000"/>
+          <w:sz w:val="21"/>
+          <w:szCs w:val="21"/>
+          <w:lang w:val="en-US" w:eastAsia="en-US"/>
+        </w:rPr>
+      </w:pPr>
+      <w:r>
+        <w:rPr>
+          <w:rFonts w:ascii="Consolas" w:hAnsi="Consolas"/>
+          <w:color w:val="000000"/>
+          <w:sz w:val="21"/>
+          <w:szCs w:val="21"/>
+          <w:lang w:val="en-US" w:eastAsia="en-US"/>
+        </w:rPr>
+        <w:t xml:space="preserve">            </w:t>
+      </w:r>
+      <w:r>
+        <w:rPr>
+          <w:rFonts w:ascii="Consolas" w:hAnsi="Consolas"/>
+          <w:color w:val="001080"/>
+          <w:sz w:val="21"/>
+          <w:szCs w:val="21"/>
+          <w:lang w:val="en-US" w:eastAsia="en-US"/>
+        </w:rPr>
+        <w:t>validace</w:t>
+      </w:r>
+      <w:r>
+        <w:rPr>
+          <w:rFonts w:ascii="Consolas" w:hAnsi="Consolas"/>
+          <w:color w:val="000000"/>
+          <w:sz w:val="21"/>
+          <w:szCs w:val="21"/>
+          <w:lang w:val="en-US" w:eastAsia="en-US"/>
+        </w:rPr>
+        <w:t xml:space="preserve"> = </w:t>
+      </w:r>
+      <w:r>
+        <w:rPr>
+          <w:rFonts w:ascii="Consolas" w:hAnsi="Consolas"/>
+          <w:color w:val="0000FF"/>
+          <w:sz w:val="21"/>
+          <w:szCs w:val="21"/>
+          <w:lang w:val="en-US" w:eastAsia="en-US"/>
+        </w:rPr>
+        <w:t>false</w:t>
+      </w:r>
+    </w:p>
+    <w:p>
+      <w:pPr>
+        <w:shd w:val="clear" w:color="auto" w:fill="FFFFFF"/>
+        <w:spacing w:before="0" w:after="0" w:line="285" w:lineRule="atLeast"/>
+        <w:ind w:firstLine="0"/>
+        <w:jc w:val="left"/>
+        <w:rPr>
+          <w:rFonts w:ascii="Consolas" w:hAnsi="Consolas"/>
+          <w:color w:val="000000"/>
+          <w:sz w:val="21"/>
+          <w:szCs w:val="21"/>
+          <w:lang w:val="en-US" w:eastAsia="en-US"/>
+        </w:rPr>
+      </w:pPr>
+      <w:r>
+        <w:rPr>
+          <w:rFonts w:ascii="Consolas" w:hAnsi="Consolas"/>
+          <w:color w:val="000000"/>
+          <w:sz w:val="21"/>
+          <w:szCs w:val="21"/>
+          <w:lang w:val="en-US" w:eastAsia="en-US"/>
+        </w:rPr>
+        <w:t>        }</w:t>
+      </w:r>
+    </w:p>
+    <w:p>
+      <w:pPr>
+        <w:shd w:val="clear" w:color="auto" w:fill="FFFFFF"/>
+        <w:spacing w:before="0" w:after="0" w:line="285" w:lineRule="atLeast"/>
+        <w:ind w:firstLine="0"/>
+        <w:jc w:val="left"/>
+        <w:rPr>
+          <w:rFonts w:ascii="Consolas" w:hAnsi="Consolas"/>
+          <w:color w:val="000000"/>
+          <w:sz w:val="21"/>
+          <w:szCs w:val="21"/>
+          <w:lang w:val="en-US" w:eastAsia="en-US"/>
+        </w:rPr>
+      </w:pPr>
+      <w:r>
+        <w:rPr>
+          <w:rFonts w:ascii="Consolas" w:hAnsi="Consolas"/>
+          <w:color w:val="000000"/>
+          <w:sz w:val="21"/>
+          <w:szCs w:val="21"/>
+          <w:lang w:val="en-US" w:eastAsia="en-US"/>
+        </w:rPr>
+        <w:t xml:space="preserve">        </w:t>
+      </w:r>
+      <w:r>
+        <w:rPr>
+          <w:rFonts w:ascii="Consolas" w:hAnsi="Consolas"/>
+          <w:color w:val="AF00DB"/>
+          <w:sz w:val="21"/>
+          <w:szCs w:val="21"/>
+          <w:lang w:val="en-US" w:eastAsia="en-US"/>
+        </w:rPr>
+        <w:t>if</w:t>
+      </w:r>
+      <w:r>
+        <w:rPr>
+          <w:rFonts w:ascii="Consolas" w:hAnsi="Consolas"/>
+          <w:color w:val="000000"/>
+          <w:sz w:val="21"/>
+          <w:szCs w:val="21"/>
+          <w:lang w:val="en-US" w:eastAsia="en-US"/>
+        </w:rPr>
+        <w:t>(!</w:t>
+      </w:r>
+      <w:r>
+        <w:rPr>
+          <w:rFonts w:ascii="Consolas" w:hAnsi="Consolas"/>
+          <w:color w:val="001080"/>
+          <w:sz w:val="21"/>
+          <w:szCs w:val="21"/>
+          <w:lang w:val="en-US" w:eastAsia="en-US"/>
+        </w:rPr>
+        <w:t>hesloRegex</w:t>
+      </w:r>
+      <w:r>
+        <w:rPr>
+          <w:rFonts w:ascii="Consolas" w:hAnsi="Consolas"/>
+          <w:color w:val="000000"/>
+          <w:sz w:val="21"/>
+          <w:szCs w:val="21"/>
+          <w:lang w:val="en-US" w:eastAsia="en-US"/>
+        </w:rPr>
+        <w:t>.</w:t>
+      </w:r>
+      <w:r>
+        <w:rPr>
+          <w:rFonts w:ascii="Consolas" w:hAnsi="Consolas"/>
+          <w:color w:val="795E26"/>
+          <w:sz w:val="21"/>
+          <w:szCs w:val="21"/>
+          <w:lang w:val="en-US" w:eastAsia="en-US"/>
+        </w:rPr>
+        <w:t>test</w:t>
+      </w:r>
+      <w:r>
+        <w:rPr>
+          <w:rFonts w:ascii="Consolas" w:hAnsi="Consolas"/>
+          <w:color w:val="000000"/>
+          <w:sz w:val="21"/>
+          <w:szCs w:val="21"/>
+          <w:lang w:val="en-US" w:eastAsia="en-US"/>
+        </w:rPr>
+        <w:t>(</w:t>
+      </w:r>
+      <w:r>
+        <w:rPr>
+          <w:rFonts w:ascii="Consolas" w:hAnsi="Consolas"/>
+          <w:color w:val="001080"/>
+          <w:sz w:val="21"/>
+          <w:szCs w:val="21"/>
+          <w:lang w:val="en-US" w:eastAsia="en-US"/>
+        </w:rPr>
+        <w:t>hesla</w:t>
+      </w:r>
+      <w:r>
+        <w:rPr>
+          <w:rFonts w:ascii="Consolas" w:hAnsi="Consolas"/>
+          <w:color w:val="000000"/>
+          <w:sz w:val="21"/>
+          <w:szCs w:val="21"/>
+          <w:lang w:val="en-US" w:eastAsia="en-US"/>
+        </w:rPr>
+        <w:t>[</w:t>
+      </w:r>
+      <w:r>
+        <w:rPr>
+          <w:rFonts w:ascii="Consolas" w:hAnsi="Consolas"/>
+          <w:color w:val="098658"/>
+          <w:sz w:val="21"/>
+          <w:szCs w:val="21"/>
+          <w:lang w:val="en-US" w:eastAsia="en-US"/>
+        </w:rPr>
+        <w:t>0</w:t>
+      </w:r>
+      <w:r>
+        <w:rPr>
+          <w:rFonts w:ascii="Consolas" w:hAnsi="Consolas"/>
+          <w:color w:val="000000"/>
+          <w:sz w:val="21"/>
+          <w:szCs w:val="21"/>
+          <w:lang w:val="en-US" w:eastAsia="en-US"/>
+        </w:rPr>
+        <w:t>].</w:t>
+      </w:r>
+      <w:r>
+        <w:rPr>
+          <w:rFonts w:ascii="Consolas" w:hAnsi="Consolas"/>
+          <w:color w:val="001080"/>
+          <w:sz w:val="21"/>
+          <w:szCs w:val="21"/>
+          <w:lang w:val="en-US" w:eastAsia="en-US"/>
+        </w:rPr>
+        <w:t>value</w:t>
+      </w:r>
+      <w:r>
+        <w:rPr>
+          <w:rFonts w:ascii="Consolas" w:hAnsi="Consolas"/>
+          <w:color w:val="000000"/>
+          <w:sz w:val="21"/>
+          <w:szCs w:val="21"/>
+          <w:lang w:val="en-US" w:eastAsia="en-US"/>
+        </w:rPr>
+        <w:t>)) {</w:t>
+      </w:r>
+    </w:p>
+    <w:p>
+      <w:pPr>
+        <w:shd w:val="clear" w:color="auto" w:fill="FFFFFF"/>
+        <w:spacing w:before="0" w:after="0" w:line="285" w:lineRule="atLeast"/>
+        <w:ind w:firstLine="0"/>
+        <w:jc w:val="left"/>
+        <w:rPr>
+          <w:rFonts w:ascii="Consolas" w:hAnsi="Consolas"/>
+          <w:color w:val="000000"/>
+          <w:sz w:val="21"/>
+          <w:szCs w:val="21"/>
+          <w:lang w:val="en-US" w:eastAsia="en-US"/>
+        </w:rPr>
+      </w:pPr>
+      <w:r>
+        <w:rPr>
+          <w:rFonts w:ascii="Consolas" w:hAnsi="Consolas"/>
+          <w:color w:val="000000"/>
+          <w:sz w:val="21"/>
+          <w:szCs w:val="21"/>
+          <w:lang w:val="en-US" w:eastAsia="en-US"/>
+        </w:rPr>
+        <w:t xml:space="preserve">            </w:t>
+      </w:r>
+      <w:r>
+        <w:rPr>
+          <w:rFonts w:ascii="Consolas" w:hAnsi="Consolas"/>
+          <w:color w:val="001080"/>
+          <w:sz w:val="21"/>
+          <w:szCs w:val="21"/>
+          <w:lang w:val="en-US" w:eastAsia="en-US"/>
+        </w:rPr>
+        <w:t>zprava</w:t>
+      </w:r>
+      <w:r>
+        <w:rPr>
+          <w:rFonts w:ascii="Consolas" w:hAnsi="Consolas"/>
+          <w:color w:val="000000"/>
+          <w:sz w:val="21"/>
+          <w:szCs w:val="21"/>
+          <w:lang w:val="en-US" w:eastAsia="en-US"/>
+        </w:rPr>
+        <w:t xml:space="preserve"> += </w:t>
+      </w:r>
+      <w:r>
+        <w:rPr>
+          <w:rFonts w:ascii="Consolas" w:hAnsi="Consolas"/>
+          <w:color w:val="A31515"/>
+          <w:sz w:val="21"/>
+          <w:szCs w:val="21"/>
+          <w:lang w:val="en-US" w:eastAsia="en-US"/>
+        </w:rPr>
+        <w:t>"heslo neopovídá daným požadavkům, "</w:t>
+      </w:r>
+    </w:p>
+    <w:p>
+      <w:pPr>
+        <w:shd w:val="clear" w:color="auto" w:fill="FFFFFF"/>
+        <w:spacing w:before="0" w:after="0" w:line="285" w:lineRule="atLeast"/>
+        <w:ind w:firstLine="0"/>
+        <w:jc w:val="left"/>
+        <w:rPr>
+          <w:rFonts w:ascii="Consolas" w:hAnsi="Consolas"/>
+          <w:color w:val="000000"/>
+          <w:sz w:val="21"/>
+          <w:szCs w:val="21"/>
+          <w:lang w:val="en-US" w:eastAsia="en-US"/>
+        </w:rPr>
+      </w:pPr>
+      <w:r>
+        <w:rPr>
+          <w:rFonts w:ascii="Consolas" w:hAnsi="Consolas"/>
+          <w:color w:val="000000"/>
+          <w:sz w:val="21"/>
+          <w:szCs w:val="21"/>
+          <w:lang w:val="en-US" w:eastAsia="en-US"/>
+        </w:rPr>
+        <w:t xml:space="preserve">            </w:t>
+      </w:r>
+      <w:r>
+        <w:rPr>
+          <w:rFonts w:ascii="Consolas" w:hAnsi="Consolas"/>
+          <w:color w:val="001080"/>
+          <w:sz w:val="21"/>
+          <w:szCs w:val="21"/>
+          <w:lang w:val="en-US" w:eastAsia="en-US"/>
+        </w:rPr>
+        <w:t>validace</w:t>
+      </w:r>
+      <w:r>
+        <w:rPr>
+          <w:rFonts w:ascii="Consolas" w:hAnsi="Consolas"/>
+          <w:color w:val="000000"/>
+          <w:sz w:val="21"/>
+          <w:szCs w:val="21"/>
+          <w:lang w:val="en-US" w:eastAsia="en-US"/>
+        </w:rPr>
+        <w:t xml:space="preserve"> = </w:t>
+      </w:r>
+      <w:r>
+        <w:rPr>
+          <w:rFonts w:ascii="Consolas" w:hAnsi="Consolas"/>
+          <w:color w:val="0000FF"/>
+          <w:sz w:val="21"/>
+          <w:szCs w:val="21"/>
+          <w:lang w:val="en-US" w:eastAsia="en-US"/>
+        </w:rPr>
+        <w:t>false</w:t>
+      </w:r>
+    </w:p>
+    <w:p>
+      <w:pPr>
+        <w:shd w:val="clear" w:color="auto" w:fill="FFFFFF"/>
+        <w:spacing w:before="0" w:after="0" w:line="285" w:lineRule="atLeast"/>
+        <w:ind w:firstLine="0"/>
+        <w:jc w:val="left"/>
+        <w:rPr>
+          <w:rFonts w:ascii="Consolas" w:hAnsi="Consolas"/>
+          <w:color w:val="000000"/>
+          <w:sz w:val="21"/>
+          <w:szCs w:val="21"/>
+          <w:lang w:val="en-US" w:eastAsia="en-US"/>
+        </w:rPr>
+      </w:pPr>
+      <w:r>
+        <w:rPr>
+          <w:rFonts w:ascii="Consolas" w:hAnsi="Consolas"/>
+          <w:color w:val="000000"/>
+          <w:sz w:val="21"/>
+          <w:szCs w:val="21"/>
+          <w:lang w:val="en-US" w:eastAsia="en-US"/>
+        </w:rPr>
+        <w:t>        }</w:t>
+      </w:r>
+    </w:p>
+    <w:p>
+      <w:pPr>
+        <w:shd w:val="clear" w:color="auto" w:fill="FFFFFF"/>
+        <w:spacing w:before="0" w:after="0" w:line="285" w:lineRule="atLeast"/>
+        <w:ind w:firstLine="0"/>
+        <w:jc w:val="left"/>
+        <w:rPr>
+          <w:rFonts w:ascii="Consolas" w:hAnsi="Consolas"/>
+          <w:color w:val="000000"/>
+          <w:sz w:val="21"/>
+          <w:szCs w:val="21"/>
+          <w:lang w:val="en-US" w:eastAsia="en-US"/>
+        </w:rPr>
+      </w:pPr>
+      <w:r>
+        <w:rPr>
+          <w:rFonts w:ascii="Consolas" w:hAnsi="Consolas"/>
+          <w:color w:val="000000"/>
+          <w:sz w:val="21"/>
+          <w:szCs w:val="21"/>
+          <w:lang w:val="en-US" w:eastAsia="en-US"/>
+        </w:rPr>
+        <w:t xml:space="preserve">        </w:t>
+      </w:r>
+      <w:r>
+        <w:rPr>
+          <w:rFonts w:ascii="Consolas" w:hAnsi="Consolas"/>
+          <w:color w:val="AF00DB"/>
+          <w:sz w:val="21"/>
+          <w:szCs w:val="21"/>
+          <w:lang w:val="en-US" w:eastAsia="en-US"/>
+        </w:rPr>
+        <w:t>if</w:t>
+      </w:r>
+      <w:r>
+        <w:rPr>
+          <w:rFonts w:ascii="Consolas" w:hAnsi="Consolas"/>
+          <w:color w:val="000000"/>
+          <w:sz w:val="21"/>
+          <w:szCs w:val="21"/>
+          <w:lang w:val="en-US" w:eastAsia="en-US"/>
+        </w:rPr>
+        <w:t xml:space="preserve"> (</w:t>
+      </w:r>
+      <w:r>
+        <w:rPr>
+          <w:rFonts w:ascii="Consolas" w:hAnsi="Consolas"/>
+          <w:color w:val="001080"/>
+          <w:sz w:val="21"/>
+          <w:szCs w:val="21"/>
+          <w:lang w:val="en-US" w:eastAsia="en-US"/>
+        </w:rPr>
+        <w:t>hesla</w:t>
+      </w:r>
+      <w:r>
+        <w:rPr>
+          <w:rFonts w:ascii="Consolas" w:hAnsi="Consolas"/>
+          <w:color w:val="000000"/>
+          <w:sz w:val="21"/>
+          <w:szCs w:val="21"/>
+          <w:lang w:val="en-US" w:eastAsia="en-US"/>
+        </w:rPr>
+        <w:t>[</w:t>
+      </w:r>
+      <w:r>
+        <w:rPr>
+          <w:rFonts w:ascii="Consolas" w:hAnsi="Consolas"/>
+          <w:color w:val="098658"/>
+          <w:sz w:val="21"/>
+          <w:szCs w:val="21"/>
+          <w:lang w:val="en-US" w:eastAsia="en-US"/>
+        </w:rPr>
+        <w:t>0</w:t>
+      </w:r>
+      <w:r>
+        <w:rPr>
+          <w:rFonts w:ascii="Consolas" w:hAnsi="Consolas"/>
+          <w:color w:val="000000"/>
+          <w:sz w:val="21"/>
+          <w:szCs w:val="21"/>
+          <w:lang w:val="en-US" w:eastAsia="en-US"/>
+        </w:rPr>
+        <w:t>].</w:t>
+      </w:r>
+      <w:r>
+        <w:rPr>
+          <w:rFonts w:ascii="Consolas" w:hAnsi="Consolas"/>
+          <w:color w:val="001080"/>
+          <w:sz w:val="21"/>
+          <w:szCs w:val="21"/>
+          <w:lang w:val="en-US" w:eastAsia="en-US"/>
+        </w:rPr>
+        <w:t>value</w:t>
+      </w:r>
+      <w:r>
+        <w:rPr>
+          <w:rFonts w:ascii="Consolas" w:hAnsi="Consolas"/>
+          <w:color w:val="000000"/>
+          <w:sz w:val="21"/>
+          <w:szCs w:val="21"/>
+          <w:lang w:val="en-US" w:eastAsia="en-US"/>
+        </w:rPr>
+        <w:t xml:space="preserve"> !== </w:t>
+      </w:r>
+      <w:r>
+        <w:rPr>
+          <w:rFonts w:ascii="Consolas" w:hAnsi="Consolas"/>
+          <w:color w:val="001080"/>
+          <w:sz w:val="21"/>
+          <w:szCs w:val="21"/>
+          <w:lang w:val="en-US" w:eastAsia="en-US"/>
+        </w:rPr>
+        <w:t>hesla</w:t>
+      </w:r>
+      <w:r>
+        <w:rPr>
+          <w:rFonts w:ascii="Consolas" w:hAnsi="Consolas"/>
+          <w:color w:val="000000"/>
+          <w:sz w:val="21"/>
+          <w:szCs w:val="21"/>
+          <w:lang w:val="en-US" w:eastAsia="en-US"/>
+        </w:rPr>
+        <w:t>[</w:t>
+      </w:r>
+      <w:r>
+        <w:rPr>
+          <w:rFonts w:ascii="Consolas" w:hAnsi="Consolas"/>
+          <w:color w:val="098658"/>
+          <w:sz w:val="21"/>
+          <w:szCs w:val="21"/>
+          <w:lang w:val="en-US" w:eastAsia="en-US"/>
+        </w:rPr>
+        <w:t>1</w:t>
+      </w:r>
+      <w:r>
+        <w:rPr>
+          <w:rFonts w:ascii="Consolas" w:hAnsi="Consolas"/>
+          <w:color w:val="000000"/>
+          <w:sz w:val="21"/>
+          <w:szCs w:val="21"/>
+          <w:lang w:val="en-US" w:eastAsia="en-US"/>
+        </w:rPr>
+        <w:t>].</w:t>
+      </w:r>
+      <w:r>
+        <w:rPr>
+          <w:rFonts w:ascii="Consolas" w:hAnsi="Consolas"/>
+          <w:color w:val="001080"/>
+          <w:sz w:val="21"/>
+          <w:szCs w:val="21"/>
+          <w:lang w:val="en-US" w:eastAsia="en-US"/>
+        </w:rPr>
+        <w:t>value</w:t>
+      </w:r>
+      <w:r>
+        <w:rPr>
+          <w:rFonts w:ascii="Consolas" w:hAnsi="Consolas"/>
+          <w:color w:val="000000"/>
+          <w:sz w:val="21"/>
+          <w:szCs w:val="21"/>
+          <w:lang w:val="en-US" w:eastAsia="en-US"/>
+        </w:rPr>
+        <w:t>) {</w:t>
+      </w:r>
+    </w:p>
+    <w:p>
+      <w:pPr>
+        <w:shd w:val="clear" w:color="auto" w:fill="FFFFFF"/>
+        <w:spacing w:before="0" w:after="0" w:line="285" w:lineRule="atLeast"/>
+        <w:ind w:firstLine="0"/>
+        <w:jc w:val="left"/>
+        <w:rPr>
+          <w:rFonts w:ascii="Consolas" w:hAnsi="Consolas"/>
+          <w:color w:val="000000"/>
+          <w:sz w:val="21"/>
+          <w:szCs w:val="21"/>
+          <w:lang w:val="en-US" w:eastAsia="en-US"/>
+        </w:rPr>
+      </w:pPr>
+      <w:r>
+        <w:rPr>
+          <w:rFonts w:ascii="Consolas" w:hAnsi="Consolas"/>
+          <w:color w:val="000000"/>
+          <w:sz w:val="21"/>
+          <w:szCs w:val="21"/>
+          <w:lang w:val="en-US" w:eastAsia="en-US"/>
+        </w:rPr>
+        <w:t xml:space="preserve">            </w:t>
+      </w:r>
+      <w:r>
+        <w:rPr>
+          <w:rFonts w:ascii="Consolas" w:hAnsi="Consolas"/>
+          <w:color w:val="001080"/>
+          <w:sz w:val="21"/>
+          <w:szCs w:val="21"/>
+          <w:lang w:val="en-US" w:eastAsia="en-US"/>
+        </w:rPr>
+        <w:t>zprava</w:t>
+      </w:r>
+      <w:r>
+        <w:rPr>
+          <w:rFonts w:ascii="Consolas" w:hAnsi="Consolas"/>
+          <w:color w:val="000000"/>
+          <w:sz w:val="21"/>
+          <w:szCs w:val="21"/>
+          <w:lang w:val="en-US" w:eastAsia="en-US"/>
+        </w:rPr>
+        <w:t xml:space="preserve"> += </w:t>
+      </w:r>
+      <w:r>
+        <w:rPr>
+          <w:rFonts w:ascii="Consolas" w:hAnsi="Consolas"/>
+          <w:color w:val="A31515"/>
+          <w:sz w:val="21"/>
+          <w:szCs w:val="21"/>
+          <w:lang w:val="en-US" w:eastAsia="en-US"/>
+        </w:rPr>
+        <w:t>"Hesla nejsou stejná, "</w:t>
+      </w:r>
+    </w:p>
+    <w:p>
+      <w:pPr>
+        <w:shd w:val="clear" w:color="auto" w:fill="FFFFFF"/>
+        <w:spacing w:before="0" w:after="0" w:line="285" w:lineRule="atLeast"/>
+        <w:ind w:firstLine="0"/>
+        <w:jc w:val="left"/>
+        <w:rPr>
+          <w:rFonts w:ascii="Consolas" w:hAnsi="Consolas"/>
+          <w:color w:val="000000"/>
+          <w:sz w:val="21"/>
+          <w:szCs w:val="21"/>
+          <w:lang w:val="en-US" w:eastAsia="en-US"/>
+        </w:rPr>
+      </w:pPr>
+      <w:r>
+        <w:rPr>
+          <w:rFonts w:ascii="Consolas" w:hAnsi="Consolas"/>
+          <w:color w:val="000000"/>
+          <w:sz w:val="21"/>
+          <w:szCs w:val="21"/>
+          <w:lang w:val="en-US" w:eastAsia="en-US"/>
+        </w:rPr>
+        <w:t xml:space="preserve">            </w:t>
+      </w:r>
+      <w:r>
+        <w:rPr>
+          <w:rFonts w:ascii="Consolas" w:hAnsi="Consolas"/>
+          <w:color w:val="001080"/>
+          <w:sz w:val="21"/>
+          <w:szCs w:val="21"/>
+          <w:lang w:val="en-US" w:eastAsia="en-US"/>
+        </w:rPr>
+        <w:t>validace</w:t>
+      </w:r>
+      <w:r>
+        <w:rPr>
+          <w:rFonts w:ascii="Consolas" w:hAnsi="Consolas"/>
+          <w:color w:val="000000"/>
+          <w:sz w:val="21"/>
+          <w:szCs w:val="21"/>
+          <w:lang w:val="en-US" w:eastAsia="en-US"/>
+        </w:rPr>
+        <w:t xml:space="preserve"> = </w:t>
+      </w:r>
+      <w:r>
+        <w:rPr>
+          <w:rFonts w:ascii="Consolas" w:hAnsi="Consolas"/>
+          <w:color w:val="0000FF"/>
+          <w:sz w:val="21"/>
+          <w:szCs w:val="21"/>
+          <w:lang w:val="en-US" w:eastAsia="en-US"/>
+        </w:rPr>
+        <w:t>false</w:t>
+      </w:r>
+    </w:p>
+    <w:p>
+      <w:pPr>
+        <w:shd w:val="clear" w:color="auto" w:fill="FFFFFF"/>
+        <w:spacing w:before="0" w:after="0" w:line="285" w:lineRule="atLeast"/>
+        <w:ind w:firstLine="0"/>
+        <w:jc w:val="left"/>
+        <w:rPr>
+          <w:rFonts w:ascii="Consolas" w:hAnsi="Consolas"/>
+          <w:color w:val="000000"/>
+          <w:sz w:val="21"/>
+          <w:szCs w:val="21"/>
+          <w:lang w:val="en-US" w:eastAsia="en-US"/>
+        </w:rPr>
+      </w:pPr>
+      <w:r>
+        <w:rPr>
+          <w:rFonts w:ascii="Consolas" w:hAnsi="Consolas"/>
+          <w:color w:val="000000"/>
+          <w:sz w:val="21"/>
+          <w:szCs w:val="21"/>
+          <w:lang w:val="en-US" w:eastAsia="en-US"/>
+        </w:rPr>
+        <w:t>        }</w:t>
+      </w:r>
+    </w:p>
+    <w:p>
+      <w:pPr>
+        <w:shd w:val="clear" w:color="auto" w:fill="FFFFFF"/>
+        <w:spacing w:before="0" w:after="0" w:line="285" w:lineRule="atLeast"/>
+        <w:ind w:firstLine="0"/>
+        <w:jc w:val="left"/>
+        <w:rPr>
+          <w:rFonts w:ascii="Consolas" w:hAnsi="Consolas"/>
+          <w:color w:val="000000"/>
+          <w:sz w:val="21"/>
+          <w:szCs w:val="21"/>
+          <w:lang w:val="en-US" w:eastAsia="en-US"/>
+        </w:rPr>
+      </w:pPr>
+      <w:r>
+        <w:rPr>
+          <w:rFonts w:ascii="Consolas" w:hAnsi="Consolas"/>
+          <w:color w:val="000000"/>
+          <w:sz w:val="21"/>
+          <w:szCs w:val="21"/>
+          <w:lang w:val="en-US" w:eastAsia="en-US"/>
+        </w:rPr>
+        <w:t>    }</w:t>
+      </w:r>
+    </w:p>
+    <w:p>
+      <w:pPr>
+        <w:rPr>
+          <w:lang w:val="en-US" w:eastAsia="en-US"/>
+        </w:rPr>
+      </w:pPr>
+    </w:p>
+    <w:p/>
     <w:p/>
     <w:p>
       <w:pPr>
@@ -5033,25 +7891,13 @@
     </w:p>
     <w:p>
       <w:r>
-        <w:t xml:space="preserve">Účelem mého maturitního projektu bylo vytvořit uživatelsky přívětivý webový portál, který bude snadno ovladatelný. </w:t>
-      </w:r>
-      <w:r>
-        <w:t>Usiloval</w:t>
-      </w:r>
-      <w:r>
-        <w:t xml:space="preserve"> jsem</w:t>
-      </w:r>
-      <w:r>
-        <w:t xml:space="preserve">, aby stránka nebyla komplikovaná a aby obsahovala funkce a možnosti, které zákazník očekává při návštěvě </w:t>
+        <w:t xml:space="preserve">Účelem mého maturitního projektu bylo vytvořit uživatelsky přívětivý webový portál, který bude snadno ovladatelný. Usiloval jsem, aby stránka nebyla komplikovaná a aby obsahovala funkce a možnosti, které zákazník očekává při návštěvě </w:t>
       </w:r>
       <w:r>
         <w:t>e-shopu</w:t>
       </w:r>
       <w:r>
-        <w:t xml:space="preserve"> na sportovní vybavení</w:t>
-      </w:r>
-      <w:r>
-        <w:t>.</w:t>
+        <w:t xml:space="preserve"> na sportovní vybavení.</w:t>
       </w:r>
     </w:p>
     <w:p>
@@ -5114,15 +7960,7 @@
           <w:kern w:val="3"/>
           <w:lang w:eastAsia="zh-CN"/>
         </w:rPr>
-        <w:t>Práce na maturitním projektu byla zatím moje největší výzva. Nikdy jsem nezkoušel naprogramovat větší projekt, a tedy jsem měl s čím bojovat. Nakonec jsem všechny mnou zadané body vyřešil ideálně i přes veškeré překážky.</w:t>
-      </w:r>
-      <w:r>
-        <w:rPr>
-          <w:rFonts w:eastAsia="Arial"/>
-          <w:kern w:val="3"/>
-          <w:lang w:eastAsia="zh-CN"/>
-        </w:rPr>
-        <w:t xml:space="preserve"> Určitě bych si chtěl v</w:t>
+        <w:t>Práce na maturitním projektu byla zatím moje největší výzva. Nikdy jsem nezkoušel naprogramovat větší projekt, a tedy jsem měl s čím bojovat. Nakonec jsem všechny mnou zadané body vyřešil ideálně i přes veškeré překážky. Určitě bych si chtěl v</w:t>
       </w:r>
       <w:r>
         <w:rPr>
@@ -8704,10 +11542,6 @@
 </file>
 
 <file path=customXml/item1.xml><?xml version="1.0" encoding="utf-8"?>
-<b:Sources xmlns:b="http://schemas.openxmlformats.org/officeDocument/2006/bibliography" xmlns="http://schemas.openxmlformats.org/officeDocument/2006/bibliography" SelectedStyle="\APA.XSL" StyleName="APA"/>
-</file>
-
-<file path=customXml/item2.xml><?xml version="1.0" encoding="utf-8"?>
 <ct:contentTypeSchema xmlns:ct="http://schemas.microsoft.com/office/2006/metadata/contentType" xmlns:ma="http://schemas.microsoft.com/office/2006/metadata/properties/metaAttributes" ct:_="" ma:_="" ma:contentTypeName="Dokument" ma:contentTypeID="0x010100A17F9DD7F5F5334BB036B63B2EF49322" ma:contentTypeVersion="0" ma:contentTypeDescription="Vytvoří nový dokument" ma:contentTypeScope="" ma:versionID="4bac23a6933205f1f21d0948ef86f258">
   <xsd:schema xmlns:xsd="http://www.w3.org/2001/XMLSchema" xmlns:xs="http://www.w3.org/2001/XMLSchema" xmlns:p="http://schemas.microsoft.com/office/2006/metadata/properties" targetNamespace="http://schemas.microsoft.com/office/2006/metadata/properties" ma:root="true" ma:fieldsID="356a39de006ecca0b50c64b3c1baaa63">
     <xsd:element name="properties">
@@ -8821,6 +11655,10 @@
 </ct:contentTypeSchema>
 </file>
 
+<file path=customXml/item2.xml><?xml version="1.0" encoding="utf-8"?>
+<b:Sources xmlns:b="http://schemas.openxmlformats.org/officeDocument/2006/bibliography" xmlns="http://schemas.openxmlformats.org/officeDocument/2006/bibliography" SelectedStyle="\APA.XSL" StyleName="APA"/>
+</file>
+
 <file path=customXml/item3.xml><?xml version="1.0" encoding="utf-8"?>
 <?mso-contentType ?>
 <FormTemplates xmlns="http://schemas.microsoft.com/sharepoint/v3/contenttype/forms">
@@ -8831,14 +11669,6 @@
 </file>
 
 <file path=customXml/itemProps1.xml><?xml version="1.0" encoding="utf-8"?>
-<ds:datastoreItem xmlns:ds="http://schemas.openxmlformats.org/officeDocument/2006/customXml" ds:itemID="{C9D9B952-BBA5-4186-A34C-41B4F6FB32F7}">
-  <ds:schemaRefs>
-    <ds:schemaRef ds:uri="http://schemas.openxmlformats.org/officeDocument/2006/bibliography"/>
-  </ds:schemaRefs>
-</ds:datastoreItem>
-</file>
-
-<file path=customXml/itemProps2.xml><?xml version="1.0" encoding="utf-8"?>
 <ds:datastoreItem xmlns:ds="http://schemas.openxmlformats.org/officeDocument/2006/customXml" ds:itemID="{F4C11370-C71C-4AA5-9B06-3B119FFB773C}">
   <ds:schemaRefs>
     <ds:schemaRef ds:uri="http://schemas.microsoft.com/office/2006/metadata/contentType"/>
@@ -8854,6 +11684,14 @@
 </ds:datastoreItem>
 </file>
 
+<file path=customXml/itemProps2.xml><?xml version="1.0" encoding="utf-8"?>
+<ds:datastoreItem xmlns:ds="http://schemas.openxmlformats.org/officeDocument/2006/customXml" ds:itemID="{C9D9B952-BBA5-4186-A34C-41B4F6FB32F7}">
+  <ds:schemaRefs>
+    <ds:schemaRef ds:uri="http://schemas.openxmlformats.org/officeDocument/2006/bibliography"/>
+  </ds:schemaRefs>
+</ds:datastoreItem>
+</file>
+
 <file path=customXml/itemProps3.xml><?xml version="1.0" encoding="utf-8"?>
 <ds:datastoreItem xmlns:ds="http://schemas.openxmlformats.org/officeDocument/2006/customXml" ds:itemID="{9303BD5E-813A-4229-AA01-5D2CD8EC92AB}">
   <ds:schemaRefs>

</xml_diff>